<commit_message>
Family Tree Page - Done
</commit_message>
<xml_diff>
--- a/client/images/Henry VIII Family Tree.docx
+++ b/client/images/Henry VIII Family Tree.docx
@@ -18,6 +18,9 @@
         <w:t xml:space="preserve"> </w:t>
       </w:r>
       <w:r>
+        <w:rPr>
+          <w:noProof/>
+        </w:rPr>
         <w:drawing>
           <wp:inline distT="0" distB="0" distL="0" distR="0" wp14:anchorId="2480A3CC" wp14:editId="705734C6">
             <wp:extent cx="2880360" cy="3674305"/>
@@ -58,6 +61,9 @@
         <w:t xml:space="preserve"> </w:t>
       </w:r>
       <w:r>
+        <w:rPr>
+          <w:noProof/>
+        </w:rPr>
         <w:drawing>
           <wp:inline distT="0" distB="0" distL="0" distR="0" wp14:anchorId="3478462A" wp14:editId="05289653">
             <wp:extent cx="2905530" cy="3772426"/>
@@ -159,15 +165,12 @@
         <w:rPr>
           <w:noProof/>
         </w:rPr>
-        <w:t>decisive</w:t>
+        <w:t xml:space="preserve">decisive </w:t>
       </w:r>
       <w:r>
         <w:rPr>
           <w:noProof/>
         </w:rPr>
-        <w:t xml:space="preserve"> </w:t>
-      </w:r>
-      <w:r>
         <w:lastRenderedPageBreak/>
         <w:drawing>
           <wp:inline distT="0" distB="0" distL="0" distR="0" wp14:anchorId="57F7AE2A" wp14:editId="53E164FD">
@@ -248,7 +251,6 @@
         <w:t xml:space="preserve"> </w:t>
       </w:r>
       <w:proofErr w:type="spellStart"/>
-      <w:proofErr w:type="gramStart"/>
       <w:r>
         <w:t>fff</w:t>
       </w:r>
@@ -259,7 +261,6 @@
       <w:r>
         <w:t>decisive</w:t>
       </w:r>
-      <w:proofErr w:type="gramEnd"/>
       <w:r>
         <w:t xml:space="preserve"> </w:t>
       </w:r>
@@ -354,8 +355,46 @@
         </mc:AlternateContent>
       </w:r>
     </w:p>
-    <w:p/>
-    <w:p/>
+    <w:p>
+      <w:r>
+        <w:lastRenderedPageBreak/>
+        <w:drawing>
+          <wp:inline distT="0" distB="0" distL="0" distR="0" wp14:anchorId="22FC8C65" wp14:editId="3D19372C">
+            <wp:extent cx="5943600" cy="3931920"/>
+            <wp:effectExtent l="0" t="0" r="0" b="0"/>
+            <wp:docPr id="1813545138" name="Picture 1"/>
+            <wp:cNvGraphicFramePr>
+              <a:graphicFrameLocks xmlns:a="http://schemas.openxmlformats.org/drawingml/2006/main" noChangeAspect="1"/>
+            </wp:cNvGraphicFramePr>
+            <a:graphic xmlns:a="http://schemas.openxmlformats.org/drawingml/2006/main">
+              <a:graphicData uri="http://schemas.openxmlformats.org/drawingml/2006/picture">
+                <pic:pic xmlns:pic="http://schemas.openxmlformats.org/drawingml/2006/picture">
+                  <pic:nvPicPr>
+                    <pic:cNvPr id="1813545138" name=""/>
+                    <pic:cNvPicPr/>
+                  </pic:nvPicPr>
+                  <pic:blipFill>
+                    <a:blip r:embed="rId7"/>
+                    <a:stretch>
+                      <a:fillRect/>
+                    </a:stretch>
+                  </pic:blipFill>
+                  <pic:spPr>
+                    <a:xfrm>
+                      <a:off x="0" y="0"/>
+                      <a:ext cx="5943600" cy="3931920"/>
+                    </a:xfrm>
+                    <a:prstGeom prst="rect">
+                      <a:avLst/>
+                    </a:prstGeom>
+                  </pic:spPr>
+                </pic:pic>
+              </a:graphicData>
+            </a:graphic>
+          </wp:inline>
+        </w:drawing>
+      </w:r>
+    </w:p>
     <w:p>
       <w:r>
         <w:rPr>
@@ -364,16 +403,16 @@
         <mc:AlternateContent>
           <mc:Choice Requires="wps">
             <w:drawing>
-              <wp:anchor distT="45720" distB="45720" distL="114300" distR="114300" simplePos="0" relativeHeight="251662336" behindDoc="0" locked="0" layoutInCell="1" allowOverlap="1" wp14:anchorId="040F27E7" wp14:editId="13D606FE">
+              <wp:anchor distT="45720" distB="45720" distL="114300" distR="114300" simplePos="0" relativeHeight="251662336" behindDoc="0" locked="0" layoutInCell="1" allowOverlap="1" wp14:anchorId="040F27E7" wp14:editId="5448F434">
                 <wp:simplePos x="0" y="0"/>
                 <wp:positionH relativeFrom="column">
-                  <wp:posOffset>2019300</wp:posOffset>
+                  <wp:posOffset>2484120</wp:posOffset>
                 </wp:positionH>
                 <wp:positionV relativeFrom="paragraph">
-                  <wp:posOffset>10795</wp:posOffset>
+                  <wp:posOffset>0</wp:posOffset>
                 </wp:positionV>
                 <wp:extent cx="883920" cy="335280"/>
-                <wp:effectExtent l="0" t="0" r="11430" b="26670"/>
+                <wp:effectExtent l="0" t="0" r="22860" b="26670"/>
                 <wp:wrapSquare wrapText="bothSides"/>
                 <wp:docPr id="217" name="Text Box 2"/>
                 <wp:cNvGraphicFramePr>
@@ -410,10 +449,16 @@
                           <w:p>
                             <w:pPr>
                               <w:rPr>
+                                <w:b/>
+                                <w:bCs/>
                                 <w:color w:val="FFFFFF" w:themeColor="background1"/>
                               </w:rPr>
                             </w:pPr>
                             <w:r>
+                              <w:rPr>
+                                <w:b/>
+                                <w:bCs/>
+                              </w:rPr>
                               <w:t>Henry VII</w:t>
                             </w:r>
                           </w:p>
@@ -440,16 +485,22 @@
                 <v:stroke joinstyle="miter"/>
                 <v:path gradientshapeok="t" o:connecttype="rect"/>
               </v:shapetype>
-              <v:shape id="Text Box 2" o:spid="_x0000_s1026" type="#_x0000_t202" style="position:absolute;margin-left:159pt;margin-top:.85pt;width:69.6pt;height:26.4pt;z-index:251662336;visibility:visible;mso-wrap-style:square;mso-width-percent:0;mso-height-percent:0;mso-wrap-distance-left:9pt;mso-wrap-distance-top:3.6pt;mso-wrap-distance-right:9pt;mso-wrap-distance-bottom:3.6pt;mso-position-horizontal:absolute;mso-position-horizontal-relative:text;mso-position-vertical:absolute;mso-position-vertical-relative:text;mso-width-percent:0;mso-height-percent:0;mso-width-relative:margin;mso-height-relative:margin;v-text-anchor:top" o:gfxdata="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">
+              <v:shape id="Text Box 2" o:spid="_x0000_s1026" type="#_x0000_t202" style="position:absolute;margin-left:195.6pt;margin-top:0;width:69.6pt;height:26.4pt;z-index:251662336;visibility:visible;mso-wrap-style:square;mso-width-percent:0;mso-height-percent:0;mso-wrap-distance-left:9pt;mso-wrap-distance-top:3.6pt;mso-wrap-distance-right:9pt;mso-wrap-distance-bottom:3.6pt;mso-position-horizontal:absolute;mso-position-horizontal-relative:text;mso-position-vertical:absolute;mso-position-vertical-relative:text;mso-width-percent:0;mso-height-percent:0;mso-width-relative:margin;mso-height-relative:margin;v-text-anchor:top" o:gfxdata="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">
                 <v:textbox>
                   <w:txbxContent>
                     <w:p>
                       <w:pPr>
                         <w:rPr>
+                          <w:b/>
+                          <w:bCs/>
                           <w:color w:val="FFFFFF" w:themeColor="background1"/>
                         </w:rPr>
                       </w:pPr>
                       <w:r>
+                        <w:rPr>
+                          <w:b/>
+                          <w:bCs/>
+                        </w:rPr>
                         <w:t>Henry VII</w:t>
                       </w:r>
                     </w:p>
@@ -461,6 +512,9 @@
           </mc:Fallback>
         </mc:AlternateContent>
       </w:r>
+      <w:r>
+        <w:t xml:space="preserve"> </w:t>
+      </w:r>
     </w:p>
     <w:p>
       <w:r>
@@ -470,13 +524,1660 @@
         <mc:AlternateContent>
           <mc:Choice Requires="wps">
             <w:drawing>
-              <wp:anchor distT="45720" distB="45720" distL="114300" distR="114300" simplePos="0" relativeHeight="251705344" behindDoc="0" locked="0" layoutInCell="1" allowOverlap="1" wp14:anchorId="243769D3" wp14:editId="4B868D8F">
+              <wp:anchor distT="0" distB="0" distL="114300" distR="114300" simplePos="0" relativeHeight="251663360" behindDoc="0" locked="0" layoutInCell="1" allowOverlap="1" wp14:anchorId="307B3EBA" wp14:editId="6CC8E9EB">
+                <wp:simplePos x="0" y="0"/>
+                <wp:positionH relativeFrom="column">
+                  <wp:posOffset>2903220</wp:posOffset>
+                </wp:positionH>
+                <wp:positionV relativeFrom="paragraph">
+                  <wp:posOffset>10795</wp:posOffset>
+                </wp:positionV>
+                <wp:extent cx="7620" cy="594360"/>
+                <wp:effectExtent l="0" t="0" r="30480" b="34290"/>
+                <wp:wrapNone/>
+                <wp:docPr id="677499438" name="Straight Connector 4"/>
+                <wp:cNvGraphicFramePr/>
+                <a:graphic xmlns:a="http://schemas.openxmlformats.org/drawingml/2006/main">
+                  <a:graphicData uri="http://schemas.microsoft.com/office/word/2010/wordprocessingShape">
+                    <wps:wsp>
+                      <wps:cNvCnPr/>
+                      <wps:spPr>
+                        <a:xfrm>
+                          <a:off x="0" y="0"/>
+                          <a:ext cx="7620" cy="594360"/>
+                        </a:xfrm>
+                        <a:prstGeom prst="line">
+                          <a:avLst/>
+                        </a:prstGeom>
+                      </wps:spPr>
+                      <wps:style>
+                        <a:lnRef idx="2">
+                          <a:schemeClr val="dk1"/>
+                        </a:lnRef>
+                        <a:fillRef idx="0">
+                          <a:schemeClr val="dk1"/>
+                        </a:fillRef>
+                        <a:effectRef idx="1">
+                          <a:schemeClr val="dk1"/>
+                        </a:effectRef>
+                        <a:fontRef idx="minor">
+                          <a:schemeClr val="tx1"/>
+                        </a:fontRef>
+                      </wps:style>
+                      <wps:bodyPr/>
+                    </wps:wsp>
+                  </a:graphicData>
+                </a:graphic>
+                <wp14:sizeRelH relativeFrom="margin">
+                  <wp14:pctWidth>0</wp14:pctWidth>
+                </wp14:sizeRelH>
+                <wp14:sizeRelV relativeFrom="margin">
+                  <wp14:pctHeight>0</wp14:pctHeight>
+                </wp14:sizeRelV>
+              </wp:anchor>
+            </w:drawing>
+          </mc:Choice>
+          <mc:Fallback>
+            <w:pict>
+              <v:line w14:anchorId="1696BA8E" id="Straight Connector 4" o:spid="_x0000_s1026" style="position:absolute;z-index:251663360;visibility:visible;mso-wrap-style:square;mso-width-percent:0;mso-height-percent:0;mso-wrap-distance-left:9pt;mso-wrap-distance-top:0;mso-wrap-distance-right:9pt;mso-wrap-distance-bottom:0;mso-position-horizontal:absolute;mso-position-horizontal-relative:text;mso-position-vertical:absolute;mso-position-vertical-relative:text;mso-width-percent:0;mso-height-percent:0;mso-width-relative:margin;mso-height-relative:margin" from="228.6pt,.85pt" to="229.2pt,47.65pt" o:gfxdata="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" strokecolor="black [3200]" strokeweight="1.5pt">
+                <v:stroke joinstyle="miter"/>
+              </v:line>
+            </w:pict>
+          </mc:Fallback>
+        </mc:AlternateContent>
+      </w:r>
+    </w:p>
+    <w:p>
+      <w:r>
+        <w:rPr>
+          <w:noProof/>
+        </w:rPr>
+        <mc:AlternateContent>
+          <mc:Choice Requires="wps">
+            <w:drawing>
+              <wp:anchor distT="0" distB="0" distL="114300" distR="114300" simplePos="0" relativeHeight="251711488" behindDoc="0" locked="0" layoutInCell="1" allowOverlap="1" wp14:anchorId="354F564F" wp14:editId="270E6D88">
+                <wp:simplePos x="0" y="0"/>
+                <wp:positionH relativeFrom="column">
+                  <wp:posOffset>3291840</wp:posOffset>
+                </wp:positionH>
+                <wp:positionV relativeFrom="paragraph">
+                  <wp:posOffset>1796415</wp:posOffset>
+                </wp:positionV>
+                <wp:extent cx="0" cy="335280"/>
+                <wp:effectExtent l="0" t="0" r="38100" b="26670"/>
+                <wp:wrapNone/>
+                <wp:docPr id="21293789" name="Straight Connector 32"/>
+                <wp:cNvGraphicFramePr/>
+                <a:graphic xmlns:a="http://schemas.openxmlformats.org/drawingml/2006/main">
+                  <a:graphicData uri="http://schemas.microsoft.com/office/word/2010/wordprocessingShape">
+                    <wps:wsp>
+                      <wps:cNvCnPr/>
+                      <wps:spPr>
+                        <a:xfrm>
+                          <a:off x="0" y="0"/>
+                          <a:ext cx="0" cy="335280"/>
+                        </a:xfrm>
+                        <a:prstGeom prst="line">
+                          <a:avLst/>
+                        </a:prstGeom>
+                      </wps:spPr>
+                      <wps:style>
+                        <a:lnRef idx="2">
+                          <a:schemeClr val="dk1"/>
+                        </a:lnRef>
+                        <a:fillRef idx="0">
+                          <a:schemeClr val="dk1"/>
+                        </a:fillRef>
+                        <a:effectRef idx="1">
+                          <a:schemeClr val="dk1"/>
+                        </a:effectRef>
+                        <a:fontRef idx="minor">
+                          <a:schemeClr val="tx1"/>
+                        </a:fontRef>
+                      </wps:style>
+                      <wps:bodyPr/>
+                    </wps:wsp>
+                  </a:graphicData>
+                </a:graphic>
+                <wp14:sizeRelH relativeFrom="margin">
+                  <wp14:pctWidth>0</wp14:pctWidth>
+                </wp14:sizeRelH>
+                <wp14:sizeRelV relativeFrom="margin">
+                  <wp14:pctHeight>0</wp14:pctHeight>
+                </wp14:sizeRelV>
+              </wp:anchor>
+            </w:drawing>
+          </mc:Choice>
+          <mc:Fallback>
+            <w:pict>
+              <v:line w14:anchorId="36ECD7EB" id="Straight Connector 32" o:spid="_x0000_s1026" style="position:absolute;z-index:251711488;visibility:visible;mso-wrap-style:square;mso-width-percent:0;mso-height-percent:0;mso-wrap-distance-left:9pt;mso-wrap-distance-top:0;mso-wrap-distance-right:9pt;mso-wrap-distance-bottom:0;mso-position-horizontal:absolute;mso-position-horizontal-relative:text;mso-position-vertical:absolute;mso-position-vertical-relative:text;mso-width-percent:0;mso-height-percent:0;mso-width-relative:margin;mso-height-relative:margin" from="259.2pt,141.45pt" to="259.2pt,167.85pt" o:gfxdata="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" strokecolor="black [3200]" strokeweight="1.5pt">
+                <v:stroke joinstyle="miter"/>
+              </v:line>
+            </w:pict>
+          </mc:Fallback>
+        </mc:AlternateContent>
+      </w:r>
+      <w:r>
+        <w:rPr>
+          <w:noProof/>
+        </w:rPr>
+        <mc:AlternateContent>
+          <mc:Choice Requires="wps">
+            <w:drawing>
+              <wp:anchor distT="0" distB="0" distL="114300" distR="114300" simplePos="0" relativeHeight="251726848" behindDoc="0" locked="0" layoutInCell="1" allowOverlap="1" wp14:anchorId="3F277FE7" wp14:editId="56110FAF">
+                <wp:simplePos x="0" y="0"/>
+                <wp:positionH relativeFrom="column">
+                  <wp:posOffset>4335780</wp:posOffset>
+                </wp:positionH>
+                <wp:positionV relativeFrom="paragraph">
+                  <wp:posOffset>2626995</wp:posOffset>
+                </wp:positionV>
+                <wp:extent cx="0" cy="304800"/>
+                <wp:effectExtent l="0" t="0" r="38100" b="19050"/>
+                <wp:wrapNone/>
+                <wp:docPr id="65617153" name="Straight Connector 42"/>
+                <wp:cNvGraphicFramePr/>
+                <a:graphic xmlns:a="http://schemas.openxmlformats.org/drawingml/2006/main">
+                  <a:graphicData uri="http://schemas.microsoft.com/office/word/2010/wordprocessingShape">
+                    <wps:wsp>
+                      <wps:cNvCnPr/>
+                      <wps:spPr>
+                        <a:xfrm>
+                          <a:off x="0" y="0"/>
+                          <a:ext cx="0" cy="304800"/>
+                        </a:xfrm>
+                        <a:prstGeom prst="line">
+                          <a:avLst/>
+                        </a:prstGeom>
+                      </wps:spPr>
+                      <wps:style>
+                        <a:lnRef idx="2">
+                          <a:schemeClr val="dk1"/>
+                        </a:lnRef>
+                        <a:fillRef idx="0">
+                          <a:schemeClr val="dk1"/>
+                        </a:fillRef>
+                        <a:effectRef idx="1">
+                          <a:schemeClr val="dk1"/>
+                        </a:effectRef>
+                        <a:fontRef idx="minor">
+                          <a:schemeClr val="tx1"/>
+                        </a:fontRef>
+                      </wps:style>
+                      <wps:bodyPr/>
+                    </wps:wsp>
+                  </a:graphicData>
+                </a:graphic>
+                <wp14:sizeRelH relativeFrom="margin">
+                  <wp14:pctWidth>0</wp14:pctWidth>
+                </wp14:sizeRelH>
+                <wp14:sizeRelV relativeFrom="margin">
+                  <wp14:pctHeight>0</wp14:pctHeight>
+                </wp14:sizeRelV>
+              </wp:anchor>
+            </w:drawing>
+          </mc:Choice>
+          <mc:Fallback>
+            <w:pict>
+              <v:line w14:anchorId="20ED7378" id="Straight Connector 42" o:spid="_x0000_s1026" style="position:absolute;z-index:251726848;visibility:visible;mso-wrap-style:square;mso-width-percent:0;mso-height-percent:0;mso-wrap-distance-left:9pt;mso-wrap-distance-top:0;mso-wrap-distance-right:9pt;mso-wrap-distance-bottom:0;mso-position-horizontal:absolute;mso-position-horizontal-relative:text;mso-position-vertical:absolute;mso-position-vertical-relative:text;mso-width-percent:0;mso-height-percent:0;mso-width-relative:margin;mso-height-relative:margin" from="341.4pt,206.85pt" to="341.4pt,230.85pt" o:gfxdata="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" strokecolor="black [3200]" strokeweight="1.5pt">
+                <v:stroke joinstyle="miter"/>
+              </v:line>
+            </w:pict>
+          </mc:Fallback>
+        </mc:AlternateContent>
+      </w:r>
+      <w:r>
+        <w:rPr>
+          <w:noProof/>
+        </w:rPr>
+        <mc:AlternateContent>
+          <mc:Choice Requires="wps">
+            <w:drawing>
+              <wp:anchor distT="45720" distB="45720" distL="114300" distR="114300" simplePos="0" relativeHeight="251725824" behindDoc="0" locked="0" layoutInCell="1" allowOverlap="1" wp14:anchorId="0C7E65E1" wp14:editId="3AE408DC">
+                <wp:simplePos x="0" y="0"/>
+                <wp:positionH relativeFrom="column">
+                  <wp:posOffset>3893820</wp:posOffset>
+                </wp:positionH>
+                <wp:positionV relativeFrom="paragraph">
+                  <wp:posOffset>2931795</wp:posOffset>
+                </wp:positionV>
+                <wp:extent cx="891540" cy="556260"/>
+                <wp:effectExtent l="0" t="0" r="22860" b="15240"/>
+                <wp:wrapSquare wrapText="bothSides"/>
+                <wp:docPr id="1122997323" name="Text Box 2"/>
+                <wp:cNvGraphicFramePr>
+                  <a:graphicFrameLocks xmlns:a="http://schemas.openxmlformats.org/drawingml/2006/main"/>
+                </wp:cNvGraphicFramePr>
+                <a:graphic xmlns:a="http://schemas.openxmlformats.org/drawingml/2006/main">
+                  <a:graphicData uri="http://schemas.microsoft.com/office/word/2010/wordprocessingShape">
+                    <wps:wsp>
+                      <wps:cNvSpPr txBox="1">
+                        <a:spLocks noChangeArrowheads="1"/>
+                      </wps:cNvSpPr>
+                      <wps:spPr bwMode="auto">
+                        <a:xfrm>
+                          <a:off x="0" y="0"/>
+                          <a:ext cx="891540" cy="556260"/>
+                        </a:xfrm>
+                        <a:prstGeom prst="rect">
+                          <a:avLst/>
+                        </a:prstGeom>
+                        <a:solidFill>
+                          <a:srgbClr val="FFFFFF"/>
+                        </a:solidFill>
+                        <a:ln w="9525">
+                          <a:solidFill>
+                            <a:srgbClr val="000000"/>
+                          </a:solidFill>
+                          <a:miter lim="800000"/>
+                          <a:headEnd/>
+                          <a:tailEnd/>
+                        </a:ln>
+                      </wps:spPr>
+                      <wps:txbx>
+                        <w:txbxContent>
+                          <w:p>
+                            <w:r>
+                              <w:t xml:space="preserve">Edward Seymour </w:t>
+                            </w:r>
+                          </w:p>
+                        </w:txbxContent>
+                      </wps:txbx>
+                      <wps:bodyPr rot="0" vert="horz" wrap="square" lIns="91440" tIns="45720" rIns="91440" bIns="45720" anchor="t" anchorCtr="0">
+                        <a:noAutofit/>
+                      </wps:bodyPr>
+                    </wps:wsp>
+                  </a:graphicData>
+                </a:graphic>
+                <wp14:sizeRelH relativeFrom="margin">
+                  <wp14:pctWidth>0</wp14:pctWidth>
+                </wp14:sizeRelH>
+                <wp14:sizeRelV relativeFrom="margin">
+                  <wp14:pctHeight>0</wp14:pctHeight>
+                </wp14:sizeRelV>
+              </wp:anchor>
+            </w:drawing>
+          </mc:Choice>
+          <mc:Fallback>
+            <w:pict>
+              <v:shape w14:anchorId="0C7E65E1" id="_x0000_s1027" type="#_x0000_t202" style="position:absolute;margin-left:306.6pt;margin-top:230.85pt;width:70.2pt;height:43.8pt;z-index:251725824;visibility:visible;mso-wrap-style:square;mso-width-percent:0;mso-height-percent:0;mso-wrap-distance-left:9pt;mso-wrap-distance-top:3.6pt;mso-wrap-distance-right:9pt;mso-wrap-distance-bottom:3.6pt;mso-position-horizontal:absolute;mso-position-horizontal-relative:text;mso-position-vertical:absolute;mso-position-vertical-relative:text;mso-width-percent:0;mso-height-percent:0;mso-width-relative:margin;mso-height-relative:margin;v-text-anchor:top" o:gfxdata="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">
+                <v:textbox>
+                  <w:txbxContent>
+                    <w:p>
+                      <w:r>
+                        <w:t xml:space="preserve">Edward Seymour </w:t>
+                      </w:r>
+                    </w:p>
+                  </w:txbxContent>
+                </v:textbox>
+                <w10:wrap type="square"/>
+              </v:shape>
+            </w:pict>
+          </mc:Fallback>
+        </mc:AlternateContent>
+      </w:r>
+      <w:r>
+        <w:rPr>
+          <w:noProof/>
+        </w:rPr>
+        <mc:AlternateContent>
+          <mc:Choice Requires="wps">
+            <w:drawing>
+              <wp:anchor distT="0" distB="0" distL="114300" distR="114300" simplePos="0" relativeHeight="251723776" behindDoc="0" locked="0" layoutInCell="1" allowOverlap="1" wp14:anchorId="3416D159" wp14:editId="0B4619C9">
+                <wp:simplePos x="0" y="0"/>
+                <wp:positionH relativeFrom="column">
+                  <wp:posOffset>6073140</wp:posOffset>
+                </wp:positionH>
+                <wp:positionV relativeFrom="paragraph">
+                  <wp:posOffset>1293495</wp:posOffset>
+                </wp:positionV>
+                <wp:extent cx="0" cy="205740"/>
+                <wp:effectExtent l="0" t="0" r="38100" b="22860"/>
+                <wp:wrapNone/>
+                <wp:docPr id="105615270" name="Straight Connector 40"/>
+                <wp:cNvGraphicFramePr/>
+                <a:graphic xmlns:a="http://schemas.openxmlformats.org/drawingml/2006/main">
+                  <a:graphicData uri="http://schemas.microsoft.com/office/word/2010/wordprocessingShape">
+                    <wps:wsp>
+                      <wps:cNvCnPr/>
+                      <wps:spPr>
+                        <a:xfrm>
+                          <a:off x="0" y="0"/>
+                          <a:ext cx="0" cy="205740"/>
+                        </a:xfrm>
+                        <a:prstGeom prst="line">
+                          <a:avLst/>
+                        </a:prstGeom>
+                      </wps:spPr>
+                      <wps:style>
+                        <a:lnRef idx="2">
+                          <a:schemeClr val="dk1"/>
+                        </a:lnRef>
+                        <a:fillRef idx="0">
+                          <a:schemeClr val="dk1"/>
+                        </a:fillRef>
+                        <a:effectRef idx="1">
+                          <a:schemeClr val="dk1"/>
+                        </a:effectRef>
+                        <a:fontRef idx="minor">
+                          <a:schemeClr val="tx1"/>
+                        </a:fontRef>
+                      </wps:style>
+                      <wps:bodyPr/>
+                    </wps:wsp>
+                  </a:graphicData>
+                </a:graphic>
+                <wp14:sizeRelH relativeFrom="margin">
+                  <wp14:pctWidth>0</wp14:pctWidth>
+                </wp14:sizeRelH>
+                <wp14:sizeRelV relativeFrom="margin">
+                  <wp14:pctHeight>0</wp14:pctHeight>
+                </wp14:sizeRelV>
+              </wp:anchor>
+            </w:drawing>
+          </mc:Choice>
+          <mc:Fallback>
+            <w:pict>
+              <v:line w14:anchorId="27B233B4" id="Straight Connector 40" o:spid="_x0000_s1026" style="position:absolute;z-index:251723776;visibility:visible;mso-wrap-style:square;mso-width-percent:0;mso-height-percent:0;mso-wrap-distance-left:9pt;mso-wrap-distance-top:0;mso-wrap-distance-right:9pt;mso-wrap-distance-bottom:0;mso-position-horizontal:absolute;mso-position-horizontal-relative:text;mso-position-vertical:absolute;mso-position-vertical-relative:text;mso-width-percent:0;mso-height-percent:0;mso-width-relative:margin;mso-height-relative:margin" from="478.2pt,101.85pt" to="478.2pt,118.05pt" o:gfxdata="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" strokecolor="black [3200]" strokeweight="1.5pt">
+                <v:stroke joinstyle="miter"/>
+              </v:line>
+            </w:pict>
+          </mc:Fallback>
+        </mc:AlternateContent>
+      </w:r>
+      <w:r>
+        <w:rPr>
+          <w:noProof/>
+        </w:rPr>
+        <mc:AlternateContent>
+          <mc:Choice Requires="wps">
+            <w:drawing>
+              <wp:anchor distT="0" distB="0" distL="114300" distR="114300" simplePos="0" relativeHeight="251719680" behindDoc="0" locked="0" layoutInCell="1" allowOverlap="1" wp14:anchorId="377C1AEF" wp14:editId="7FA55362">
+                <wp:simplePos x="0" y="0"/>
+                <wp:positionH relativeFrom="column">
+                  <wp:posOffset>5212080</wp:posOffset>
+                </wp:positionH>
+                <wp:positionV relativeFrom="paragraph">
+                  <wp:posOffset>767715</wp:posOffset>
+                </wp:positionV>
+                <wp:extent cx="0" cy="121920"/>
+                <wp:effectExtent l="0" t="0" r="38100" b="30480"/>
+                <wp:wrapNone/>
+                <wp:docPr id="538844198" name="Straight Connector 36"/>
+                <wp:cNvGraphicFramePr/>
+                <a:graphic xmlns:a="http://schemas.openxmlformats.org/drawingml/2006/main">
+                  <a:graphicData uri="http://schemas.microsoft.com/office/word/2010/wordprocessingShape">
+                    <wps:wsp>
+                      <wps:cNvCnPr/>
+                      <wps:spPr>
+                        <a:xfrm flipH="1">
+                          <a:off x="0" y="0"/>
+                          <a:ext cx="0" cy="121920"/>
+                        </a:xfrm>
+                        <a:prstGeom prst="line">
+                          <a:avLst/>
+                        </a:prstGeom>
+                      </wps:spPr>
+                      <wps:style>
+                        <a:lnRef idx="2">
+                          <a:schemeClr val="dk1"/>
+                        </a:lnRef>
+                        <a:fillRef idx="0">
+                          <a:schemeClr val="dk1"/>
+                        </a:fillRef>
+                        <a:effectRef idx="1">
+                          <a:schemeClr val="dk1"/>
+                        </a:effectRef>
+                        <a:fontRef idx="minor">
+                          <a:schemeClr val="tx1"/>
+                        </a:fontRef>
+                      </wps:style>
+                      <wps:bodyPr/>
+                    </wps:wsp>
+                  </a:graphicData>
+                </a:graphic>
+                <wp14:sizeRelH relativeFrom="margin">
+                  <wp14:pctWidth>0</wp14:pctWidth>
+                </wp14:sizeRelH>
+                <wp14:sizeRelV relativeFrom="margin">
+                  <wp14:pctHeight>0</wp14:pctHeight>
+                </wp14:sizeRelV>
+              </wp:anchor>
+            </w:drawing>
+          </mc:Choice>
+          <mc:Fallback>
+            <w:pict>
+              <v:line w14:anchorId="69BDD878" id="Straight Connector 36" o:spid="_x0000_s1026" style="position:absolute;flip:x;z-index:251719680;visibility:visible;mso-wrap-style:square;mso-width-percent:0;mso-height-percent:0;mso-wrap-distance-left:9pt;mso-wrap-distance-top:0;mso-wrap-distance-right:9pt;mso-wrap-distance-bottom:0;mso-position-horizontal:absolute;mso-position-horizontal-relative:text;mso-position-vertical:absolute;mso-position-vertical-relative:text;mso-width-percent:0;mso-height-percent:0;mso-width-relative:margin;mso-height-relative:margin" from="410.4pt,60.45pt" to="410.4pt,70.05pt" o:gfxdata="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" strokecolor="black [3200]" strokeweight="1.5pt">
+                <v:stroke joinstyle="miter"/>
+              </v:line>
+            </w:pict>
+          </mc:Fallback>
+        </mc:AlternateContent>
+      </w:r>
+      <w:r>
+        <w:rPr>
+          <w:noProof/>
+        </w:rPr>
+        <mc:AlternateContent>
+          <mc:Choice Requires="wps">
+            <w:drawing>
+              <wp:anchor distT="0" distB="0" distL="114300" distR="114300" simplePos="0" relativeHeight="251722752" behindDoc="0" locked="0" layoutInCell="1" allowOverlap="1" wp14:anchorId="3232C3EA" wp14:editId="34524564">
+                <wp:simplePos x="0" y="0"/>
+                <wp:positionH relativeFrom="column">
+                  <wp:posOffset>6118860</wp:posOffset>
+                </wp:positionH>
+                <wp:positionV relativeFrom="paragraph">
+                  <wp:posOffset>866775</wp:posOffset>
+                </wp:positionV>
+                <wp:extent cx="0" cy="106680"/>
+                <wp:effectExtent l="0" t="0" r="38100" b="26670"/>
+                <wp:wrapNone/>
+                <wp:docPr id="1789150349" name="Straight Connector 39"/>
+                <wp:cNvGraphicFramePr/>
+                <a:graphic xmlns:a="http://schemas.openxmlformats.org/drawingml/2006/main">
+                  <a:graphicData uri="http://schemas.microsoft.com/office/word/2010/wordprocessingShape">
+                    <wps:wsp>
+                      <wps:cNvCnPr/>
+                      <wps:spPr>
+                        <a:xfrm flipH="1">
+                          <a:off x="0" y="0"/>
+                          <a:ext cx="0" cy="106680"/>
+                        </a:xfrm>
+                        <a:prstGeom prst="line">
+                          <a:avLst/>
+                        </a:prstGeom>
+                      </wps:spPr>
+                      <wps:style>
+                        <a:lnRef idx="2">
+                          <a:schemeClr val="dk1"/>
+                        </a:lnRef>
+                        <a:fillRef idx="0">
+                          <a:schemeClr val="dk1"/>
+                        </a:fillRef>
+                        <a:effectRef idx="1">
+                          <a:schemeClr val="dk1"/>
+                        </a:effectRef>
+                        <a:fontRef idx="minor">
+                          <a:schemeClr val="tx1"/>
+                        </a:fontRef>
+                      </wps:style>
+                      <wps:bodyPr/>
+                    </wps:wsp>
+                  </a:graphicData>
+                </a:graphic>
+                <wp14:sizeRelH relativeFrom="margin">
+                  <wp14:pctWidth>0</wp14:pctWidth>
+                </wp14:sizeRelH>
+                <wp14:sizeRelV relativeFrom="margin">
+                  <wp14:pctHeight>0</wp14:pctHeight>
+                </wp14:sizeRelV>
+              </wp:anchor>
+            </w:drawing>
+          </mc:Choice>
+          <mc:Fallback>
+            <w:pict>
+              <v:line w14:anchorId="132CFA1A" id="Straight Connector 39" o:spid="_x0000_s1026" style="position:absolute;flip:x;z-index:251722752;visibility:visible;mso-wrap-style:square;mso-width-percent:0;mso-height-percent:0;mso-wrap-distance-left:9pt;mso-wrap-distance-top:0;mso-wrap-distance-right:9pt;mso-wrap-distance-bottom:0;mso-position-horizontal:absolute;mso-position-horizontal-relative:text;mso-position-vertical:absolute;mso-position-vertical-relative:text;mso-width-percent:0;mso-height-percent:0;mso-width-relative:margin;mso-height-relative:margin" from="481.8pt,68.25pt" to="481.8pt,76.65pt" o:gfxdata="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" strokecolor="black [3200]" strokeweight="1.5pt">
+                <v:stroke joinstyle="miter"/>
+              </v:line>
+            </w:pict>
+          </mc:Fallback>
+        </mc:AlternateContent>
+      </w:r>
+      <w:r>
+        <w:rPr>
+          <w:noProof/>
+        </w:rPr>
+        <mc:AlternateContent>
+          <mc:Choice Requires="wps">
+            <w:drawing>
+              <wp:anchor distT="0" distB="0" distL="114300" distR="114300" simplePos="0" relativeHeight="251721728" behindDoc="0" locked="0" layoutInCell="1" allowOverlap="1" wp14:anchorId="7B44DA4B" wp14:editId="4DF28450">
                 <wp:simplePos x="0" y="0"/>
                 <wp:positionH relativeFrom="column">
                   <wp:posOffset>4457700</wp:posOffset>
                 </wp:positionH>
                 <wp:positionV relativeFrom="paragraph">
-                  <wp:posOffset>2055495</wp:posOffset>
+                  <wp:posOffset>897255</wp:posOffset>
+                </wp:positionV>
+                <wp:extent cx="0" cy="137160"/>
+                <wp:effectExtent l="0" t="0" r="38100" b="34290"/>
+                <wp:wrapNone/>
+                <wp:docPr id="2060672085" name="Straight Connector 38"/>
+                <wp:cNvGraphicFramePr/>
+                <a:graphic xmlns:a="http://schemas.openxmlformats.org/drawingml/2006/main">
+                  <a:graphicData uri="http://schemas.microsoft.com/office/word/2010/wordprocessingShape">
+                    <wps:wsp>
+                      <wps:cNvCnPr/>
+                      <wps:spPr>
+                        <a:xfrm flipH="1">
+                          <a:off x="0" y="0"/>
+                          <a:ext cx="0" cy="137160"/>
+                        </a:xfrm>
+                        <a:prstGeom prst="line">
+                          <a:avLst/>
+                        </a:prstGeom>
+                      </wps:spPr>
+                      <wps:style>
+                        <a:lnRef idx="2">
+                          <a:schemeClr val="dk1"/>
+                        </a:lnRef>
+                        <a:fillRef idx="0">
+                          <a:schemeClr val="dk1"/>
+                        </a:fillRef>
+                        <a:effectRef idx="1">
+                          <a:schemeClr val="dk1"/>
+                        </a:effectRef>
+                        <a:fontRef idx="minor">
+                          <a:schemeClr val="tx1"/>
+                        </a:fontRef>
+                      </wps:style>
+                      <wps:bodyPr/>
+                    </wps:wsp>
+                  </a:graphicData>
+                </a:graphic>
+                <wp14:sizeRelH relativeFrom="margin">
+                  <wp14:pctWidth>0</wp14:pctWidth>
+                </wp14:sizeRelH>
+                <wp14:sizeRelV relativeFrom="margin">
+                  <wp14:pctHeight>0</wp14:pctHeight>
+                </wp14:sizeRelV>
+              </wp:anchor>
+            </w:drawing>
+          </mc:Choice>
+          <mc:Fallback>
+            <w:pict>
+              <v:line w14:anchorId="535E891C" id="Straight Connector 38" o:spid="_x0000_s1026" style="position:absolute;flip:x;z-index:251721728;visibility:visible;mso-wrap-style:square;mso-width-percent:0;mso-height-percent:0;mso-wrap-distance-left:9pt;mso-wrap-distance-top:0;mso-wrap-distance-right:9pt;mso-wrap-distance-bottom:0;mso-position-horizontal:absolute;mso-position-horizontal-relative:text;mso-position-vertical:absolute;mso-position-vertical-relative:text;mso-width-percent:0;mso-height-percent:0;mso-width-relative:margin;mso-height-relative:margin" from="351pt,70.65pt" to="351pt,81.45pt" o:gfxdata="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" strokecolor="black [3200]" strokeweight="1.5pt">
+                <v:stroke joinstyle="miter"/>
+              </v:line>
+            </w:pict>
+          </mc:Fallback>
+        </mc:AlternateContent>
+      </w:r>
+      <w:r>
+        <w:rPr>
+          <w:noProof/>
+        </w:rPr>
+        <mc:AlternateContent>
+          <mc:Choice Requires="wps">
+            <w:drawing>
+              <wp:anchor distT="45720" distB="45720" distL="114300" distR="114300" simplePos="0" relativeHeight="251701248" behindDoc="0" locked="0" layoutInCell="1" allowOverlap="1" wp14:anchorId="2F217765" wp14:editId="351856D2">
+                <wp:simplePos x="0" y="0"/>
+                <wp:positionH relativeFrom="column">
+                  <wp:posOffset>3870960</wp:posOffset>
+                </wp:positionH>
+                <wp:positionV relativeFrom="paragraph">
+                  <wp:posOffset>996315</wp:posOffset>
+                </wp:positionV>
+                <wp:extent cx="1310640" cy="312420"/>
+                <wp:effectExtent l="0" t="0" r="22860" b="11430"/>
+                <wp:wrapSquare wrapText="bothSides"/>
+                <wp:docPr id="1978509818" name="Text Box 2"/>
+                <wp:cNvGraphicFramePr>
+                  <a:graphicFrameLocks xmlns:a="http://schemas.openxmlformats.org/drawingml/2006/main"/>
+                </wp:cNvGraphicFramePr>
+                <a:graphic xmlns:a="http://schemas.openxmlformats.org/drawingml/2006/main">
+                  <a:graphicData uri="http://schemas.microsoft.com/office/word/2010/wordprocessingShape">
+                    <wps:wsp>
+                      <wps:cNvSpPr txBox="1">
+                        <a:spLocks noChangeArrowheads="1"/>
+                      </wps:cNvSpPr>
+                      <wps:spPr bwMode="auto">
+                        <a:xfrm>
+                          <a:off x="0" y="0"/>
+                          <a:ext cx="1310640" cy="312420"/>
+                        </a:xfrm>
+                        <a:prstGeom prst="rect">
+                          <a:avLst/>
+                        </a:prstGeom>
+                        <a:solidFill>
+                          <a:srgbClr val="FFFFFF"/>
+                        </a:solidFill>
+                        <a:ln w="9525">
+                          <a:solidFill>
+                            <a:srgbClr val="000000"/>
+                          </a:solidFill>
+                          <a:miter lim="800000"/>
+                          <a:headEnd/>
+                          <a:tailEnd/>
+                        </a:ln>
+                      </wps:spPr>
+                      <wps:txbx>
+                        <w:txbxContent>
+                          <w:p>
+                            <w:r>
+                              <w:t>Frances Brandon</w:t>
+                            </w:r>
+                          </w:p>
+                        </w:txbxContent>
+                      </wps:txbx>
+                      <wps:bodyPr rot="0" vert="horz" wrap="square" lIns="91440" tIns="45720" rIns="91440" bIns="45720" anchor="t" anchorCtr="0">
+                        <a:noAutofit/>
+                      </wps:bodyPr>
+                    </wps:wsp>
+                  </a:graphicData>
+                </a:graphic>
+                <wp14:sizeRelH relativeFrom="margin">
+                  <wp14:pctWidth>0</wp14:pctWidth>
+                </wp14:sizeRelH>
+                <wp14:sizeRelV relativeFrom="margin">
+                  <wp14:pctHeight>0</wp14:pctHeight>
+                </wp14:sizeRelV>
+              </wp:anchor>
+            </w:drawing>
+          </mc:Choice>
+          <mc:Fallback>
+            <w:pict>
+              <v:shape w14:anchorId="2F217765" id="_x0000_s1028" type="#_x0000_t202" style="position:absolute;margin-left:304.8pt;margin-top:78.45pt;width:103.2pt;height:24.6pt;z-index:251701248;visibility:visible;mso-wrap-style:square;mso-width-percent:0;mso-height-percent:0;mso-wrap-distance-left:9pt;mso-wrap-distance-top:3.6pt;mso-wrap-distance-right:9pt;mso-wrap-distance-bottom:3.6pt;mso-position-horizontal:absolute;mso-position-horizontal-relative:text;mso-position-vertical:absolute;mso-position-vertical-relative:text;mso-width-percent:0;mso-height-percent:0;mso-width-relative:margin;mso-height-relative:margin;v-text-anchor:top" o:gfxdata="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">
+                <v:textbox>
+                  <w:txbxContent>
+                    <w:p>
+                      <w:r>
+                        <w:t>Frances Brandon</w:t>
+                      </w:r>
+                    </w:p>
+                  </w:txbxContent>
+                </v:textbox>
+                <w10:wrap type="square"/>
+              </v:shape>
+            </w:pict>
+          </mc:Fallback>
+        </mc:AlternateContent>
+      </w:r>
+      <w:r>
+        <w:rPr>
+          <w:noProof/>
+        </w:rPr>
+        <mc:AlternateContent>
+          <mc:Choice Requires="wps">
+            <w:drawing>
+              <wp:anchor distT="0" distB="0" distL="114300" distR="114300" simplePos="0" relativeHeight="251720704" behindDoc="0" locked="0" layoutInCell="1" allowOverlap="1" wp14:anchorId="1F76C72C" wp14:editId="24F71086">
+                <wp:simplePos x="0" y="0"/>
+                <wp:positionH relativeFrom="column">
+                  <wp:posOffset>4450080</wp:posOffset>
+                </wp:positionH>
+                <wp:positionV relativeFrom="paragraph">
+                  <wp:posOffset>889635</wp:posOffset>
+                </wp:positionV>
+                <wp:extent cx="1684020" cy="0"/>
+                <wp:effectExtent l="0" t="0" r="0" b="0"/>
+                <wp:wrapNone/>
+                <wp:docPr id="455308513" name="Straight Connector 37"/>
+                <wp:cNvGraphicFramePr/>
+                <a:graphic xmlns:a="http://schemas.openxmlformats.org/drawingml/2006/main">
+                  <a:graphicData uri="http://schemas.microsoft.com/office/word/2010/wordprocessingShape">
+                    <wps:wsp>
+                      <wps:cNvCnPr/>
+                      <wps:spPr>
+                        <a:xfrm flipH="1" flipV="1">
+                          <a:off x="0" y="0"/>
+                          <a:ext cx="1684020" cy="0"/>
+                        </a:xfrm>
+                        <a:prstGeom prst="line">
+                          <a:avLst/>
+                        </a:prstGeom>
+                      </wps:spPr>
+                      <wps:style>
+                        <a:lnRef idx="2">
+                          <a:schemeClr val="dk1"/>
+                        </a:lnRef>
+                        <a:fillRef idx="0">
+                          <a:schemeClr val="dk1"/>
+                        </a:fillRef>
+                        <a:effectRef idx="1">
+                          <a:schemeClr val="dk1"/>
+                        </a:effectRef>
+                        <a:fontRef idx="minor">
+                          <a:schemeClr val="tx1"/>
+                        </a:fontRef>
+                      </wps:style>
+                      <wps:bodyPr/>
+                    </wps:wsp>
+                  </a:graphicData>
+                </a:graphic>
+                <wp14:sizeRelH relativeFrom="margin">
+                  <wp14:pctWidth>0</wp14:pctWidth>
+                </wp14:sizeRelH>
+                <wp14:sizeRelV relativeFrom="margin">
+                  <wp14:pctHeight>0</wp14:pctHeight>
+                </wp14:sizeRelV>
+              </wp:anchor>
+            </w:drawing>
+          </mc:Choice>
+          <mc:Fallback>
+            <w:pict>
+              <v:line w14:anchorId="2459BD59" id="Straight Connector 37" o:spid="_x0000_s1026" style="position:absolute;flip:x y;z-index:251720704;visibility:visible;mso-wrap-style:square;mso-width-percent:0;mso-height-percent:0;mso-wrap-distance-left:9pt;mso-wrap-distance-top:0;mso-wrap-distance-right:9pt;mso-wrap-distance-bottom:0;mso-position-horizontal:absolute;mso-position-horizontal-relative:text;mso-position-vertical:absolute;mso-position-vertical-relative:text;mso-width-percent:0;mso-height-percent:0;mso-width-relative:margin;mso-height-relative:margin" from="350.4pt,70.05pt" to="483pt,70.05pt" o:gfxdata="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" strokecolor="black [3200]" strokeweight="1.5pt">
+                <v:stroke joinstyle="miter"/>
+              </v:line>
+            </w:pict>
+          </mc:Fallback>
+        </mc:AlternateContent>
+      </w:r>
+      <w:r>
+        <w:rPr>
+          <w:noProof/>
+        </w:rPr>
+        <mc:AlternateContent>
+          <mc:Choice Requires="wps">
+            <w:drawing>
+              <wp:anchor distT="0" distB="0" distL="114300" distR="114300" simplePos="0" relativeHeight="251674624" behindDoc="0" locked="0" layoutInCell="1" allowOverlap="1" wp14:anchorId="0281504D" wp14:editId="110073AA">
+                <wp:simplePos x="0" y="0"/>
+                <wp:positionH relativeFrom="column">
+                  <wp:posOffset>5204460</wp:posOffset>
+                </wp:positionH>
+                <wp:positionV relativeFrom="paragraph">
+                  <wp:posOffset>287655</wp:posOffset>
+                </wp:positionV>
+                <wp:extent cx="7620" cy="251460"/>
+                <wp:effectExtent l="0" t="0" r="30480" b="34290"/>
+                <wp:wrapNone/>
+                <wp:docPr id="1570417294" name="Straight Connector 11"/>
+                <wp:cNvGraphicFramePr/>
+                <a:graphic xmlns:a="http://schemas.openxmlformats.org/drawingml/2006/main">
+                  <a:graphicData uri="http://schemas.microsoft.com/office/word/2010/wordprocessingShape">
+                    <wps:wsp>
+                      <wps:cNvCnPr/>
+                      <wps:spPr>
+                        <a:xfrm>
+                          <a:off x="0" y="0"/>
+                          <a:ext cx="7620" cy="251460"/>
+                        </a:xfrm>
+                        <a:prstGeom prst="line">
+                          <a:avLst/>
+                        </a:prstGeom>
+                      </wps:spPr>
+                      <wps:style>
+                        <a:lnRef idx="2">
+                          <a:schemeClr val="dk1"/>
+                        </a:lnRef>
+                        <a:fillRef idx="0">
+                          <a:schemeClr val="dk1"/>
+                        </a:fillRef>
+                        <a:effectRef idx="1">
+                          <a:schemeClr val="dk1"/>
+                        </a:effectRef>
+                        <a:fontRef idx="minor">
+                          <a:schemeClr val="tx1"/>
+                        </a:fontRef>
+                      </wps:style>
+                      <wps:bodyPr/>
+                    </wps:wsp>
+                  </a:graphicData>
+                </a:graphic>
+                <wp14:sizeRelH relativeFrom="margin">
+                  <wp14:pctWidth>0</wp14:pctWidth>
+                </wp14:sizeRelH>
+                <wp14:sizeRelV relativeFrom="margin">
+                  <wp14:pctHeight>0</wp14:pctHeight>
+                </wp14:sizeRelV>
+              </wp:anchor>
+            </w:drawing>
+          </mc:Choice>
+          <mc:Fallback>
+            <w:pict>
+              <v:line w14:anchorId="7A1085FC" id="Straight Connector 11" o:spid="_x0000_s1026" style="position:absolute;z-index:251674624;visibility:visible;mso-wrap-style:square;mso-width-percent:0;mso-height-percent:0;mso-wrap-distance-left:9pt;mso-wrap-distance-top:0;mso-wrap-distance-right:9pt;mso-wrap-distance-bottom:0;mso-position-horizontal:absolute;mso-position-horizontal-relative:text;mso-position-vertical:absolute;mso-position-vertical-relative:text;mso-width-percent:0;mso-height-percent:0;mso-width-relative:margin;mso-height-relative:margin" from="409.8pt,22.65pt" to="410.4pt,42.45pt" o:gfxdata="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" strokecolor="black [3200]" strokeweight="1.5pt">
+                <v:stroke joinstyle="miter"/>
+              </v:line>
+            </w:pict>
+          </mc:Fallback>
+        </mc:AlternateContent>
+      </w:r>
+      <w:r>
+        <w:rPr>
+          <w:noProof/>
+        </w:rPr>
+        <mc:AlternateContent>
+          <mc:Choice Requires="wps">
+            <w:drawing>
+              <wp:anchor distT="0" distB="0" distL="114300" distR="114300" simplePos="0" relativeHeight="251675648" behindDoc="0" locked="0" layoutInCell="1" allowOverlap="1" wp14:anchorId="352BA431" wp14:editId="4EB558ED">
+                <wp:simplePos x="0" y="0"/>
+                <wp:positionH relativeFrom="column">
+                  <wp:posOffset>2331720</wp:posOffset>
+                </wp:positionH>
+                <wp:positionV relativeFrom="paragraph">
+                  <wp:posOffset>264795</wp:posOffset>
+                </wp:positionV>
+                <wp:extent cx="0" cy="304800"/>
+                <wp:effectExtent l="0" t="0" r="38100" b="19050"/>
+                <wp:wrapNone/>
+                <wp:docPr id="1644916176" name="Straight Connector 12"/>
+                <wp:cNvGraphicFramePr/>
+                <a:graphic xmlns:a="http://schemas.openxmlformats.org/drawingml/2006/main">
+                  <a:graphicData uri="http://schemas.microsoft.com/office/word/2010/wordprocessingShape">
+                    <wps:wsp>
+                      <wps:cNvCnPr/>
+                      <wps:spPr>
+                        <a:xfrm>
+                          <a:off x="0" y="0"/>
+                          <a:ext cx="0" cy="304800"/>
+                        </a:xfrm>
+                        <a:prstGeom prst="line">
+                          <a:avLst/>
+                        </a:prstGeom>
+                      </wps:spPr>
+                      <wps:style>
+                        <a:lnRef idx="2">
+                          <a:schemeClr val="dk1"/>
+                        </a:lnRef>
+                        <a:fillRef idx="0">
+                          <a:schemeClr val="dk1"/>
+                        </a:fillRef>
+                        <a:effectRef idx="1">
+                          <a:schemeClr val="dk1"/>
+                        </a:effectRef>
+                        <a:fontRef idx="minor">
+                          <a:schemeClr val="tx1"/>
+                        </a:fontRef>
+                      </wps:style>
+                      <wps:bodyPr/>
+                    </wps:wsp>
+                  </a:graphicData>
+                </a:graphic>
+                <wp14:sizeRelH relativeFrom="margin">
+                  <wp14:pctWidth>0</wp14:pctWidth>
+                </wp14:sizeRelH>
+                <wp14:sizeRelV relativeFrom="margin">
+                  <wp14:pctHeight>0</wp14:pctHeight>
+                </wp14:sizeRelV>
+              </wp:anchor>
+            </w:drawing>
+          </mc:Choice>
+          <mc:Fallback>
+            <w:pict>
+              <v:line w14:anchorId="443E0BC3" id="Straight Connector 12" o:spid="_x0000_s1026" style="position:absolute;z-index:251675648;visibility:visible;mso-wrap-style:square;mso-width-percent:0;mso-height-percent:0;mso-wrap-distance-left:9pt;mso-wrap-distance-top:0;mso-wrap-distance-right:9pt;mso-wrap-distance-bottom:0;mso-position-horizontal:absolute;mso-position-horizontal-relative:text;mso-position-vertical:absolute;mso-position-vertical-relative:text;mso-width-percent:0;mso-height-percent:0;mso-width-relative:margin;mso-height-relative:margin" from="183.6pt,20.85pt" to="183.6pt,44.85pt" o:gfxdata="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" strokecolor="black [3200]" strokeweight="1.5pt">
+                <v:stroke joinstyle="miter"/>
+              </v:line>
+            </w:pict>
+          </mc:Fallback>
+        </mc:AlternateContent>
+      </w:r>
+      <w:r>
+        <w:rPr>
+          <w:noProof/>
+        </w:rPr>
+        <mc:AlternateContent>
+          <mc:Choice Requires="wps">
+            <w:drawing>
+              <wp:anchor distT="0" distB="0" distL="114300" distR="114300" simplePos="0" relativeHeight="251673600" behindDoc="0" locked="0" layoutInCell="1" allowOverlap="1" wp14:anchorId="7C267D79" wp14:editId="6E6AF647">
+                <wp:simplePos x="0" y="0"/>
+                <wp:positionH relativeFrom="margin">
+                  <wp:posOffset>441960</wp:posOffset>
+                </wp:positionH>
+                <wp:positionV relativeFrom="paragraph">
+                  <wp:posOffset>257175</wp:posOffset>
+                </wp:positionV>
+                <wp:extent cx="7620" cy="266700"/>
+                <wp:effectExtent l="0" t="0" r="30480" b="19050"/>
+                <wp:wrapNone/>
+                <wp:docPr id="1176422315" name="Straight Connector 4"/>
+                <wp:cNvGraphicFramePr/>
+                <a:graphic xmlns:a="http://schemas.openxmlformats.org/drawingml/2006/main">
+                  <a:graphicData uri="http://schemas.microsoft.com/office/word/2010/wordprocessingShape">
+                    <wps:wsp>
+                      <wps:cNvCnPr/>
+                      <wps:spPr>
+                        <a:xfrm>
+                          <a:off x="0" y="0"/>
+                          <a:ext cx="7620" cy="266700"/>
+                        </a:xfrm>
+                        <a:prstGeom prst="line">
+                          <a:avLst/>
+                        </a:prstGeom>
+                      </wps:spPr>
+                      <wps:style>
+                        <a:lnRef idx="2">
+                          <a:schemeClr val="dk1"/>
+                        </a:lnRef>
+                        <a:fillRef idx="0">
+                          <a:schemeClr val="dk1"/>
+                        </a:fillRef>
+                        <a:effectRef idx="1">
+                          <a:schemeClr val="dk1"/>
+                        </a:effectRef>
+                        <a:fontRef idx="minor">
+                          <a:schemeClr val="tx1"/>
+                        </a:fontRef>
+                      </wps:style>
+                      <wps:bodyPr/>
+                    </wps:wsp>
+                  </a:graphicData>
+                </a:graphic>
+                <wp14:sizeRelH relativeFrom="margin">
+                  <wp14:pctWidth>0</wp14:pctWidth>
+                </wp14:sizeRelH>
+                <wp14:sizeRelV relativeFrom="margin">
+                  <wp14:pctHeight>0</wp14:pctHeight>
+                </wp14:sizeRelV>
+              </wp:anchor>
+            </w:drawing>
+          </mc:Choice>
+          <mc:Fallback>
+            <w:pict>
+              <v:line w14:anchorId="36D87A8C" id="Straight Connector 4" o:spid="_x0000_s1026" style="position:absolute;z-index:251673600;visibility:visible;mso-wrap-style:square;mso-width-percent:0;mso-height-percent:0;mso-wrap-distance-left:9pt;mso-wrap-distance-top:0;mso-wrap-distance-right:9pt;mso-wrap-distance-bottom:0;mso-position-horizontal:absolute;mso-position-horizontal-relative:margin;mso-position-vertical:absolute;mso-position-vertical-relative:text;mso-width-percent:0;mso-height-percent:0;mso-width-relative:margin;mso-height-relative:margin" from="34.8pt,20.25pt" to="35.4pt,41.25pt" o:gfxdata="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" strokecolor="black [3200]" strokeweight="1.5pt">
+                <v:stroke joinstyle="miter"/>
+                <w10:wrap anchorx="margin"/>
+              </v:line>
+            </w:pict>
+          </mc:Fallback>
+        </mc:AlternateContent>
+      </w:r>
+      <w:r>
+        <w:rPr>
+          <w:noProof/>
+        </w:rPr>
+        <mc:AlternateContent>
+          <mc:Choice Requires="wps">
+            <w:drawing>
+              <wp:anchor distT="0" distB="0" distL="114300" distR="114300" simplePos="0" relativeHeight="251671552" behindDoc="0" locked="0" layoutInCell="1" allowOverlap="1" wp14:anchorId="0629E74B" wp14:editId="0C3166DC">
+                <wp:simplePos x="0" y="0"/>
+                <wp:positionH relativeFrom="column">
+                  <wp:posOffset>411480</wp:posOffset>
+                </wp:positionH>
+                <wp:positionV relativeFrom="paragraph">
+                  <wp:posOffset>249555</wp:posOffset>
+                </wp:positionV>
+                <wp:extent cx="4808220" cy="30480"/>
+                <wp:effectExtent l="0" t="0" r="30480" b="26670"/>
+                <wp:wrapNone/>
+                <wp:docPr id="1264586758" name="Straight Connector 7"/>
+                <wp:cNvGraphicFramePr/>
+                <a:graphic xmlns:a="http://schemas.openxmlformats.org/drawingml/2006/main">
+                  <a:graphicData uri="http://schemas.microsoft.com/office/word/2010/wordprocessingShape">
+                    <wps:wsp>
+                      <wps:cNvCnPr/>
+                      <wps:spPr>
+                        <a:xfrm>
+                          <a:off x="0" y="0"/>
+                          <a:ext cx="4808220" cy="30480"/>
+                        </a:xfrm>
+                        <a:prstGeom prst="line">
+                          <a:avLst/>
+                        </a:prstGeom>
+                      </wps:spPr>
+                      <wps:style>
+                        <a:lnRef idx="2">
+                          <a:schemeClr val="dk1"/>
+                        </a:lnRef>
+                        <a:fillRef idx="0">
+                          <a:schemeClr val="dk1"/>
+                        </a:fillRef>
+                        <a:effectRef idx="1">
+                          <a:schemeClr val="dk1"/>
+                        </a:effectRef>
+                        <a:fontRef idx="minor">
+                          <a:schemeClr val="tx1"/>
+                        </a:fontRef>
+                      </wps:style>
+                      <wps:bodyPr/>
+                    </wps:wsp>
+                  </a:graphicData>
+                </a:graphic>
+                <wp14:sizeRelH relativeFrom="margin">
+                  <wp14:pctWidth>0</wp14:pctWidth>
+                </wp14:sizeRelH>
+                <wp14:sizeRelV relativeFrom="margin">
+                  <wp14:pctHeight>0</wp14:pctHeight>
+                </wp14:sizeRelV>
+              </wp:anchor>
+            </w:drawing>
+          </mc:Choice>
+          <mc:Fallback>
+            <w:pict>
+              <v:line w14:anchorId="0922A04F" id="Straight Connector 7" o:spid="_x0000_s1026" style="position:absolute;z-index:251671552;visibility:visible;mso-wrap-style:square;mso-width-percent:0;mso-height-percent:0;mso-wrap-distance-left:9pt;mso-wrap-distance-top:0;mso-wrap-distance-right:9pt;mso-wrap-distance-bottom:0;mso-position-horizontal:absolute;mso-position-horizontal-relative:text;mso-position-vertical:absolute;mso-position-vertical-relative:text;mso-width-percent:0;mso-height-percent:0;mso-width-relative:margin;mso-height-relative:margin" from="32.4pt,19.65pt" to="411pt,22.05pt" o:gfxdata="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" strokecolor="black [3200]" strokeweight="1.5pt">
+                <v:stroke joinstyle="miter"/>
+              </v:line>
+            </w:pict>
+          </mc:Fallback>
+        </mc:AlternateContent>
+      </w:r>
+      <w:r>
+        <w:rPr>
+          <w:noProof/>
+        </w:rPr>
+        <mc:AlternateContent>
+          <mc:Choice Requires="wps">
+            <w:drawing>
+              <wp:anchor distT="45720" distB="45720" distL="114300" distR="114300" simplePos="0" relativeHeight="251718656" behindDoc="0" locked="0" layoutInCell="1" allowOverlap="1" wp14:anchorId="593D8D2D" wp14:editId="1FB3BED4">
+                <wp:simplePos x="0" y="0"/>
+                <wp:positionH relativeFrom="page">
+                  <wp:posOffset>6659880</wp:posOffset>
+                </wp:positionH>
+                <wp:positionV relativeFrom="paragraph">
+                  <wp:posOffset>1461135</wp:posOffset>
+                </wp:positionV>
+                <wp:extent cx="792480" cy="548640"/>
+                <wp:effectExtent l="0" t="0" r="26670" b="22860"/>
+                <wp:wrapSquare wrapText="bothSides"/>
+                <wp:docPr id="837053507" name="Text Box 2"/>
+                <wp:cNvGraphicFramePr>
+                  <a:graphicFrameLocks xmlns:a="http://schemas.openxmlformats.org/drawingml/2006/main"/>
+                </wp:cNvGraphicFramePr>
+                <a:graphic xmlns:a="http://schemas.openxmlformats.org/drawingml/2006/main">
+                  <a:graphicData uri="http://schemas.microsoft.com/office/word/2010/wordprocessingShape">
+                    <wps:wsp>
+                      <wps:cNvSpPr txBox="1">
+                        <a:spLocks noChangeArrowheads="1"/>
+                      </wps:cNvSpPr>
+                      <wps:spPr bwMode="auto">
+                        <a:xfrm>
+                          <a:off x="0" y="0"/>
+                          <a:ext cx="792480" cy="548640"/>
+                        </a:xfrm>
+                        <a:prstGeom prst="rect">
+                          <a:avLst/>
+                        </a:prstGeom>
+                        <a:solidFill>
+                          <a:srgbClr val="FFFFFF"/>
+                        </a:solidFill>
+                        <a:ln w="9525">
+                          <a:solidFill>
+                            <a:srgbClr val="000000"/>
+                          </a:solidFill>
+                          <a:miter lim="800000"/>
+                          <a:headEnd/>
+                          <a:tailEnd/>
+                        </a:ln>
+                      </wps:spPr>
+                      <wps:txbx>
+                        <w:txbxContent>
+                          <w:p>
+                            <w:r>
+                              <w:t>Margaret Stanley</w:t>
+                            </w:r>
+                            <w:r>
+                              <w:t xml:space="preserve"> Brandon</w:t>
+                            </w:r>
+                          </w:p>
+                        </w:txbxContent>
+                      </wps:txbx>
+                      <wps:bodyPr rot="0" vert="horz" wrap="square" lIns="91440" tIns="45720" rIns="91440" bIns="45720" anchor="t" anchorCtr="0">
+                        <a:noAutofit/>
+                      </wps:bodyPr>
+                    </wps:wsp>
+                  </a:graphicData>
+                </a:graphic>
+                <wp14:sizeRelH relativeFrom="margin">
+                  <wp14:pctWidth>0</wp14:pctWidth>
+                </wp14:sizeRelH>
+                <wp14:sizeRelV relativeFrom="margin">
+                  <wp14:pctHeight>0</wp14:pctHeight>
+                </wp14:sizeRelV>
+              </wp:anchor>
+            </w:drawing>
+          </mc:Choice>
+          <mc:Fallback>
+            <w:pict>
+              <v:shape w14:anchorId="593D8D2D" id="_x0000_s1029" type="#_x0000_t202" style="position:absolute;margin-left:524.4pt;margin-top:115.05pt;width:62.4pt;height:43.2pt;z-index:251718656;visibility:visible;mso-wrap-style:square;mso-width-percent:0;mso-height-percent:0;mso-wrap-distance-left:9pt;mso-wrap-distance-top:3.6pt;mso-wrap-distance-right:9pt;mso-wrap-distance-bottom:3.6pt;mso-position-horizontal:absolute;mso-position-horizontal-relative:page;mso-position-vertical:absolute;mso-position-vertical-relative:text;mso-width-percent:0;mso-height-percent:0;mso-width-relative:margin;mso-height-relative:margin;v-text-anchor:top" o:gfxdata="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">
+                <v:textbox>
+                  <w:txbxContent>
+                    <w:p>
+                      <w:r>
+                        <w:t>Margaret Stanley</w:t>
+                      </w:r>
+                      <w:r>
+                        <w:t xml:space="preserve"> Brandon</w:t>
+                      </w:r>
+                    </w:p>
+                  </w:txbxContent>
+                </v:textbox>
+                <w10:wrap type="square" anchorx="page"/>
+              </v:shape>
+            </w:pict>
+          </mc:Fallback>
+        </mc:AlternateContent>
+      </w:r>
+      <w:r>
+        <w:rPr>
+          <w:noProof/>
+        </w:rPr>
+        <mc:AlternateContent>
+          <mc:Choice Requires="wps">
+            <w:drawing>
+              <wp:anchor distT="45720" distB="45720" distL="114300" distR="114300" simplePos="0" relativeHeight="251670528" behindDoc="0" locked="0" layoutInCell="1" allowOverlap="1" wp14:anchorId="08D726C4" wp14:editId="1A12A27E">
+                <wp:simplePos x="0" y="0"/>
+                <wp:positionH relativeFrom="column">
+                  <wp:posOffset>4914900</wp:posOffset>
+                </wp:positionH>
+                <wp:positionV relativeFrom="paragraph">
+                  <wp:posOffset>493395</wp:posOffset>
+                </wp:positionV>
+                <wp:extent cx="609600" cy="312420"/>
+                <wp:effectExtent l="0" t="0" r="19050" b="11430"/>
+                <wp:wrapSquare wrapText="bothSides"/>
+                <wp:docPr id="1390293869" name="Text Box 2"/>
+                <wp:cNvGraphicFramePr>
+                  <a:graphicFrameLocks xmlns:a="http://schemas.openxmlformats.org/drawingml/2006/main"/>
+                </wp:cNvGraphicFramePr>
+                <a:graphic xmlns:a="http://schemas.openxmlformats.org/drawingml/2006/main">
+                  <a:graphicData uri="http://schemas.microsoft.com/office/word/2010/wordprocessingShape">
+                    <wps:wsp>
+                      <wps:cNvSpPr txBox="1">
+                        <a:spLocks noChangeArrowheads="1"/>
+                      </wps:cNvSpPr>
+                      <wps:spPr bwMode="auto">
+                        <a:xfrm>
+                          <a:off x="0" y="0"/>
+                          <a:ext cx="609600" cy="312420"/>
+                        </a:xfrm>
+                        <a:prstGeom prst="rect">
+                          <a:avLst/>
+                        </a:prstGeom>
+                        <a:solidFill>
+                          <a:srgbClr val="FFFFFF"/>
+                        </a:solidFill>
+                        <a:ln w="9525">
+                          <a:solidFill>
+                            <a:srgbClr val="000000"/>
+                          </a:solidFill>
+                          <a:miter lim="800000"/>
+                          <a:headEnd/>
+                          <a:tailEnd/>
+                        </a:ln>
+                      </wps:spPr>
+                      <wps:txbx>
+                        <w:txbxContent>
+                          <w:p>
+                            <w:r>
+                              <w:t>Mary</w:t>
+                            </w:r>
+                          </w:p>
+                        </w:txbxContent>
+                      </wps:txbx>
+                      <wps:bodyPr rot="0" vert="horz" wrap="square" lIns="91440" tIns="45720" rIns="91440" bIns="45720" anchor="t" anchorCtr="0">
+                        <a:noAutofit/>
+                      </wps:bodyPr>
+                    </wps:wsp>
+                  </a:graphicData>
+                </a:graphic>
+                <wp14:sizeRelH relativeFrom="margin">
+                  <wp14:pctWidth>0</wp14:pctWidth>
+                </wp14:sizeRelH>
+                <wp14:sizeRelV relativeFrom="margin">
+                  <wp14:pctHeight>0</wp14:pctHeight>
+                </wp14:sizeRelV>
+              </wp:anchor>
+            </w:drawing>
+          </mc:Choice>
+          <mc:Fallback>
+            <w:pict>
+              <v:shape w14:anchorId="08D726C4" id="_x0000_s1030" type="#_x0000_t202" style="position:absolute;margin-left:387pt;margin-top:38.85pt;width:48pt;height:24.6pt;z-index:251670528;visibility:visible;mso-wrap-style:square;mso-width-percent:0;mso-height-percent:0;mso-wrap-distance-left:9pt;mso-wrap-distance-top:3.6pt;mso-wrap-distance-right:9pt;mso-wrap-distance-bottom:3.6pt;mso-position-horizontal:absolute;mso-position-horizontal-relative:text;mso-position-vertical:absolute;mso-position-vertical-relative:text;mso-width-percent:0;mso-height-percent:0;mso-width-relative:margin;mso-height-relative:margin;v-text-anchor:top" o:gfxdata="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">
+                <v:textbox>
+                  <w:txbxContent>
+                    <w:p>
+                      <w:r>
+                        <w:t>Mary</w:t>
+                      </w:r>
+                    </w:p>
+                  </w:txbxContent>
+                </v:textbox>
+                <w10:wrap type="square"/>
+              </v:shape>
+            </w:pict>
+          </mc:Fallback>
+        </mc:AlternateContent>
+      </w:r>
+      <w:r>
+        <w:rPr>
+          <w:noProof/>
+        </w:rPr>
+        <mc:AlternateContent>
+          <mc:Choice Requires="wps">
+            <w:drawing>
+              <wp:anchor distT="45720" distB="45720" distL="114300" distR="114300" simplePos="0" relativeHeight="251714560" behindDoc="0" locked="0" layoutInCell="1" allowOverlap="1" wp14:anchorId="75EFFF67" wp14:editId="0E731F08">
+                <wp:simplePos x="0" y="0"/>
+                <wp:positionH relativeFrom="column">
+                  <wp:posOffset>5349240</wp:posOffset>
+                </wp:positionH>
+                <wp:positionV relativeFrom="paragraph">
+                  <wp:posOffset>973455</wp:posOffset>
+                </wp:positionV>
+                <wp:extent cx="1310640" cy="320040"/>
+                <wp:effectExtent l="0" t="0" r="22860" b="22860"/>
+                <wp:wrapSquare wrapText="bothSides"/>
+                <wp:docPr id="1761797587" name="Text Box 2"/>
+                <wp:cNvGraphicFramePr>
+                  <a:graphicFrameLocks xmlns:a="http://schemas.openxmlformats.org/drawingml/2006/main"/>
+                </wp:cNvGraphicFramePr>
+                <a:graphic xmlns:a="http://schemas.openxmlformats.org/drawingml/2006/main">
+                  <a:graphicData uri="http://schemas.microsoft.com/office/word/2010/wordprocessingShape">
+                    <wps:wsp>
+                      <wps:cNvSpPr txBox="1">
+                        <a:spLocks noChangeArrowheads="1"/>
+                      </wps:cNvSpPr>
+                      <wps:spPr bwMode="auto">
+                        <a:xfrm>
+                          <a:off x="0" y="0"/>
+                          <a:ext cx="1310640" cy="320040"/>
+                        </a:xfrm>
+                        <a:prstGeom prst="rect">
+                          <a:avLst/>
+                        </a:prstGeom>
+                        <a:solidFill>
+                          <a:srgbClr val="FFFFFF"/>
+                        </a:solidFill>
+                        <a:ln w="9525">
+                          <a:solidFill>
+                            <a:srgbClr val="000000"/>
+                          </a:solidFill>
+                          <a:miter lim="800000"/>
+                          <a:headEnd/>
+                          <a:tailEnd/>
+                        </a:ln>
+                      </wps:spPr>
+                      <wps:txbx>
+                        <w:txbxContent>
+                          <w:p>
+                            <w:r>
+                              <w:t>Eleanor Brandon</w:t>
+                            </w:r>
+                          </w:p>
+                        </w:txbxContent>
+                      </wps:txbx>
+                      <wps:bodyPr rot="0" vert="horz" wrap="square" lIns="91440" tIns="45720" rIns="91440" bIns="45720" anchor="t" anchorCtr="0">
+                        <a:noAutofit/>
+                      </wps:bodyPr>
+                    </wps:wsp>
+                  </a:graphicData>
+                </a:graphic>
+                <wp14:sizeRelH relativeFrom="margin">
+                  <wp14:pctWidth>0</wp14:pctWidth>
+                </wp14:sizeRelH>
+                <wp14:sizeRelV relativeFrom="margin">
+                  <wp14:pctHeight>0</wp14:pctHeight>
+                </wp14:sizeRelV>
+              </wp:anchor>
+            </w:drawing>
+          </mc:Choice>
+          <mc:Fallback>
+            <w:pict>
+              <v:shape w14:anchorId="75EFFF67" id="_x0000_s1031" type="#_x0000_t202" style="position:absolute;margin-left:421.2pt;margin-top:76.65pt;width:103.2pt;height:25.2pt;z-index:251714560;visibility:visible;mso-wrap-style:square;mso-width-percent:0;mso-height-percent:0;mso-wrap-distance-left:9pt;mso-wrap-distance-top:3.6pt;mso-wrap-distance-right:9pt;mso-wrap-distance-bottom:3.6pt;mso-position-horizontal:absolute;mso-position-horizontal-relative:text;mso-position-vertical:absolute;mso-position-vertical-relative:text;mso-width-percent:0;mso-height-percent:0;mso-width-relative:margin;mso-height-relative:margin;v-text-anchor:top" o:gfxdata="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">
+                <v:textbox>
+                  <w:txbxContent>
+                    <w:p>
+                      <w:r>
+                        <w:t>Eleanor Brandon</w:t>
+                      </w:r>
+                    </w:p>
+                  </w:txbxContent>
+                </v:textbox>
+                <w10:wrap type="square"/>
+              </v:shape>
+            </w:pict>
+          </mc:Fallback>
+        </mc:AlternateContent>
+      </w:r>
+      <w:r>
+        <w:rPr>
+          <w:noProof/>
+        </w:rPr>
+        <mc:AlternateContent>
+          <mc:Choice Requires="wps">
+            <w:drawing>
+              <wp:anchor distT="0" distB="0" distL="114300" distR="114300" simplePos="0" relativeHeight="251710464" behindDoc="0" locked="0" layoutInCell="1" allowOverlap="1" wp14:anchorId="5842F679" wp14:editId="23B0C3D9">
+                <wp:simplePos x="0" y="0"/>
+                <wp:positionH relativeFrom="column">
+                  <wp:posOffset>4137660</wp:posOffset>
+                </wp:positionH>
+                <wp:positionV relativeFrom="paragraph">
+                  <wp:posOffset>1804035</wp:posOffset>
+                </wp:positionV>
+                <wp:extent cx="0" cy="304800"/>
+                <wp:effectExtent l="0" t="0" r="38100" b="19050"/>
+                <wp:wrapNone/>
+                <wp:docPr id="939688971" name="Straight Connector 31"/>
+                <wp:cNvGraphicFramePr/>
+                <a:graphic xmlns:a="http://schemas.openxmlformats.org/drawingml/2006/main">
+                  <a:graphicData uri="http://schemas.microsoft.com/office/word/2010/wordprocessingShape">
+                    <wps:wsp>
+                      <wps:cNvCnPr/>
+                      <wps:spPr>
+                        <a:xfrm flipH="1">
+                          <a:off x="0" y="0"/>
+                          <a:ext cx="0" cy="304800"/>
+                        </a:xfrm>
+                        <a:prstGeom prst="line">
+                          <a:avLst/>
+                        </a:prstGeom>
+                      </wps:spPr>
+                      <wps:style>
+                        <a:lnRef idx="2">
+                          <a:schemeClr val="dk1"/>
+                        </a:lnRef>
+                        <a:fillRef idx="0">
+                          <a:schemeClr val="dk1"/>
+                        </a:fillRef>
+                        <a:effectRef idx="1">
+                          <a:schemeClr val="dk1"/>
+                        </a:effectRef>
+                        <a:fontRef idx="minor">
+                          <a:schemeClr val="tx1"/>
+                        </a:fontRef>
+                      </wps:style>
+                      <wps:bodyPr/>
+                    </wps:wsp>
+                  </a:graphicData>
+                </a:graphic>
+                <wp14:sizeRelH relativeFrom="margin">
+                  <wp14:pctWidth>0</wp14:pctWidth>
+                </wp14:sizeRelH>
+                <wp14:sizeRelV relativeFrom="margin">
+                  <wp14:pctHeight>0</wp14:pctHeight>
+                </wp14:sizeRelV>
+              </wp:anchor>
+            </w:drawing>
+          </mc:Choice>
+          <mc:Fallback>
+            <w:pict>
+              <v:line w14:anchorId="24F7DC87" id="Straight Connector 31" o:spid="_x0000_s1026" style="position:absolute;flip:x;z-index:251710464;visibility:visible;mso-wrap-style:square;mso-width-percent:0;mso-height-percent:0;mso-wrap-distance-left:9pt;mso-wrap-distance-top:0;mso-wrap-distance-right:9pt;mso-wrap-distance-bottom:0;mso-position-horizontal:absolute;mso-position-horizontal-relative:text;mso-position-vertical:absolute;mso-position-vertical-relative:text;mso-width-percent:0;mso-height-percent:0;mso-width-relative:margin;mso-height-relative:margin" from="325.8pt,142.05pt" to="325.8pt,166.05pt" o:gfxdata="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" strokecolor="black [3200]" strokeweight="1.5pt">
+                <v:stroke joinstyle="miter"/>
+              </v:line>
+            </w:pict>
+          </mc:Fallback>
+        </mc:AlternateContent>
+      </w:r>
+      <w:r>
+        <w:rPr>
+          <w:noProof/>
+        </w:rPr>
+        <mc:AlternateContent>
+          <mc:Choice Requires="wps">
+            <w:drawing>
+              <wp:anchor distT="0" distB="0" distL="114300" distR="114300" simplePos="0" relativeHeight="251708416" behindDoc="0" locked="0" layoutInCell="1" allowOverlap="1" wp14:anchorId="5E68AA80" wp14:editId="09BEFB90">
+                <wp:simplePos x="0" y="0"/>
+                <wp:positionH relativeFrom="column">
+                  <wp:posOffset>3291840</wp:posOffset>
+                </wp:positionH>
+                <wp:positionV relativeFrom="paragraph">
+                  <wp:posOffset>1804035</wp:posOffset>
+                </wp:positionV>
+                <wp:extent cx="2194560" cy="7620"/>
+                <wp:effectExtent l="0" t="0" r="34290" b="30480"/>
+                <wp:wrapNone/>
+                <wp:docPr id="2102704643" name="Straight Connector 29"/>
+                <wp:cNvGraphicFramePr/>
+                <a:graphic xmlns:a="http://schemas.openxmlformats.org/drawingml/2006/main">
+                  <a:graphicData uri="http://schemas.microsoft.com/office/word/2010/wordprocessingShape">
+                    <wps:wsp>
+                      <wps:cNvCnPr/>
+                      <wps:spPr>
+                        <a:xfrm flipV="1">
+                          <a:off x="0" y="0"/>
+                          <a:ext cx="2194560" cy="7620"/>
+                        </a:xfrm>
+                        <a:prstGeom prst="line">
+                          <a:avLst/>
+                        </a:prstGeom>
+                      </wps:spPr>
+                      <wps:style>
+                        <a:lnRef idx="2">
+                          <a:schemeClr val="dk1"/>
+                        </a:lnRef>
+                        <a:fillRef idx="0">
+                          <a:schemeClr val="dk1"/>
+                        </a:fillRef>
+                        <a:effectRef idx="1">
+                          <a:schemeClr val="dk1"/>
+                        </a:effectRef>
+                        <a:fontRef idx="minor">
+                          <a:schemeClr val="tx1"/>
+                        </a:fontRef>
+                      </wps:style>
+                      <wps:bodyPr/>
+                    </wps:wsp>
+                  </a:graphicData>
+                </a:graphic>
+                <wp14:sizeRelH relativeFrom="margin">
+                  <wp14:pctWidth>0</wp14:pctWidth>
+                </wp14:sizeRelH>
+                <wp14:sizeRelV relativeFrom="margin">
+                  <wp14:pctHeight>0</wp14:pctHeight>
+                </wp14:sizeRelV>
+              </wp:anchor>
+            </w:drawing>
+          </mc:Choice>
+          <mc:Fallback>
+            <w:pict>
+              <v:line w14:anchorId="07BCFD66" id="Straight Connector 29" o:spid="_x0000_s1026" style="position:absolute;flip:y;z-index:251708416;visibility:visible;mso-wrap-style:square;mso-width-percent:0;mso-height-percent:0;mso-wrap-distance-left:9pt;mso-wrap-distance-top:0;mso-wrap-distance-right:9pt;mso-wrap-distance-bottom:0;mso-position-horizontal:absolute;mso-position-horizontal-relative:text;mso-position-vertical:absolute;mso-position-vertical-relative:text;mso-width-percent:0;mso-height-percent:0;mso-width-relative:margin;mso-height-relative:margin" from="259.2pt,142.05pt" to="6in,142.65pt" o:gfxdata="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" strokecolor="black [3200]" strokeweight="1.5pt">
+                <v:stroke joinstyle="miter"/>
+              </v:line>
+            </w:pict>
+          </mc:Fallback>
+        </mc:AlternateContent>
+      </w:r>
+      <w:r>
+        <w:rPr>
+          <w:noProof/>
+        </w:rPr>
+        <mc:AlternateContent>
+          <mc:Choice Requires="wps">
+            <w:drawing>
+              <wp:anchor distT="0" distB="0" distL="114300" distR="114300" simplePos="0" relativeHeight="251712512" behindDoc="0" locked="0" layoutInCell="1" allowOverlap="1" wp14:anchorId="2C665049" wp14:editId="39E972D0">
+                <wp:simplePos x="0" y="0"/>
+                <wp:positionH relativeFrom="column">
+                  <wp:posOffset>5486400</wp:posOffset>
+                </wp:positionH>
+                <wp:positionV relativeFrom="paragraph">
+                  <wp:posOffset>1819275</wp:posOffset>
+                </wp:positionV>
+                <wp:extent cx="7620" cy="312420"/>
+                <wp:effectExtent l="0" t="0" r="30480" b="30480"/>
+                <wp:wrapNone/>
+                <wp:docPr id="996065360" name="Straight Connector 33"/>
+                <wp:cNvGraphicFramePr/>
+                <a:graphic xmlns:a="http://schemas.openxmlformats.org/drawingml/2006/main">
+                  <a:graphicData uri="http://schemas.microsoft.com/office/word/2010/wordprocessingShape">
+                    <wps:wsp>
+                      <wps:cNvCnPr/>
+                      <wps:spPr>
+                        <a:xfrm>
+                          <a:off x="0" y="0"/>
+                          <a:ext cx="7620" cy="312420"/>
+                        </a:xfrm>
+                        <a:prstGeom prst="line">
+                          <a:avLst/>
+                        </a:prstGeom>
+                      </wps:spPr>
+                      <wps:style>
+                        <a:lnRef idx="2">
+                          <a:schemeClr val="dk1"/>
+                        </a:lnRef>
+                        <a:fillRef idx="0">
+                          <a:schemeClr val="dk1"/>
+                        </a:fillRef>
+                        <a:effectRef idx="1">
+                          <a:schemeClr val="dk1"/>
+                        </a:effectRef>
+                        <a:fontRef idx="minor">
+                          <a:schemeClr val="tx1"/>
+                        </a:fontRef>
+                      </wps:style>
+                      <wps:bodyPr/>
+                    </wps:wsp>
+                  </a:graphicData>
+                </a:graphic>
+                <wp14:sizeRelH relativeFrom="margin">
+                  <wp14:pctWidth>0</wp14:pctWidth>
+                </wp14:sizeRelH>
+                <wp14:sizeRelV relativeFrom="margin">
+                  <wp14:pctHeight>0</wp14:pctHeight>
+                </wp14:sizeRelV>
+              </wp:anchor>
+            </w:drawing>
+          </mc:Choice>
+          <mc:Fallback>
+            <w:pict>
+              <v:line w14:anchorId="327C6255" id="Straight Connector 33" o:spid="_x0000_s1026" style="position:absolute;z-index:251712512;visibility:visible;mso-wrap-style:square;mso-width-percent:0;mso-height-percent:0;mso-wrap-distance-left:9pt;mso-wrap-distance-top:0;mso-wrap-distance-right:9pt;mso-wrap-distance-bottom:0;mso-position-horizontal:absolute;mso-position-horizontal-relative:text;mso-position-vertical:absolute;mso-position-vertical-relative:text;mso-width-percent:0;mso-height-percent:0;mso-width-relative:margin;mso-height-relative:margin" from="6in,143.25pt" to="432.6pt,167.85pt" o:gfxdata="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" strokecolor="black [3200]" strokeweight="1.5pt">
+                <v:stroke joinstyle="miter"/>
+              </v:line>
+            </w:pict>
+          </mc:Fallback>
+        </mc:AlternateContent>
+      </w:r>
+      <w:r>
+        <w:rPr>
+          <w:noProof/>
+        </w:rPr>
+        <mc:AlternateContent>
+          <mc:Choice Requires="wps">
+            <w:drawing>
+              <wp:anchor distT="0" distB="0" distL="114300" distR="114300" simplePos="0" relativeHeight="251709440" behindDoc="0" locked="0" layoutInCell="1" allowOverlap="1" wp14:anchorId="033961FF" wp14:editId="53045C85">
+                <wp:simplePos x="0" y="0"/>
+                <wp:positionH relativeFrom="column">
+                  <wp:posOffset>4335780</wp:posOffset>
+                </wp:positionH>
+                <wp:positionV relativeFrom="paragraph">
+                  <wp:posOffset>1285875</wp:posOffset>
+                </wp:positionV>
+                <wp:extent cx="7620" cy="533400"/>
+                <wp:effectExtent l="0" t="0" r="30480" b="19050"/>
+                <wp:wrapNone/>
+                <wp:docPr id="1627239121" name="Straight Connector 30"/>
+                <wp:cNvGraphicFramePr/>
+                <a:graphic xmlns:a="http://schemas.openxmlformats.org/drawingml/2006/main">
+                  <a:graphicData uri="http://schemas.microsoft.com/office/word/2010/wordprocessingShape">
+                    <wps:wsp>
+                      <wps:cNvCnPr/>
+                      <wps:spPr>
+                        <a:xfrm>
+                          <a:off x="0" y="0"/>
+                          <a:ext cx="7620" cy="533400"/>
+                        </a:xfrm>
+                        <a:prstGeom prst="line">
+                          <a:avLst/>
+                        </a:prstGeom>
+                      </wps:spPr>
+                      <wps:style>
+                        <a:lnRef idx="2">
+                          <a:schemeClr val="dk1"/>
+                        </a:lnRef>
+                        <a:fillRef idx="0">
+                          <a:schemeClr val="dk1"/>
+                        </a:fillRef>
+                        <a:effectRef idx="1">
+                          <a:schemeClr val="dk1"/>
+                        </a:effectRef>
+                        <a:fontRef idx="minor">
+                          <a:schemeClr val="tx1"/>
+                        </a:fontRef>
+                      </wps:style>
+                      <wps:bodyPr/>
+                    </wps:wsp>
+                  </a:graphicData>
+                </a:graphic>
+              </wp:anchor>
+            </w:drawing>
+          </mc:Choice>
+          <mc:Fallback>
+            <w:pict>
+              <v:line w14:anchorId="49227E66" id="Straight Connector 30" o:spid="_x0000_s1026" style="position:absolute;z-index:251709440;visibility:visible;mso-wrap-style:square;mso-wrap-distance-left:9pt;mso-wrap-distance-top:0;mso-wrap-distance-right:9pt;mso-wrap-distance-bottom:0;mso-position-horizontal:absolute;mso-position-horizontal-relative:text;mso-position-vertical:absolute;mso-position-vertical-relative:text" from="341.4pt,101.25pt" to="342pt,143.25pt" o:gfxdata="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" strokecolor="black [3200]" strokeweight="1.5pt">
+                <v:stroke joinstyle="miter"/>
+              </v:line>
+            </w:pict>
+          </mc:Fallback>
+        </mc:AlternateContent>
+      </w:r>
+      <w:r>
+        <w:rPr>
+          <w:noProof/>
+        </w:rPr>
+        <mc:AlternateContent>
+          <mc:Choice Requires="wps">
+            <w:drawing>
+              <wp:anchor distT="45720" distB="45720" distL="114300" distR="114300" simplePos="0" relativeHeight="251707392" behindDoc="0" locked="0" layoutInCell="1" allowOverlap="1" wp14:anchorId="69D21C0E" wp14:editId="2C82EDB1">
+                <wp:simplePos x="0" y="0"/>
+                <wp:positionH relativeFrom="column">
+                  <wp:posOffset>4937760</wp:posOffset>
+                </wp:positionH>
+                <wp:positionV relativeFrom="paragraph">
+                  <wp:posOffset>2124075</wp:posOffset>
+                </wp:positionV>
+                <wp:extent cx="952500" cy="312420"/>
+                <wp:effectExtent l="0" t="0" r="19050" b="11430"/>
+                <wp:wrapSquare wrapText="bothSides"/>
+                <wp:docPr id="1488809503" name="Text Box 2"/>
+                <wp:cNvGraphicFramePr>
+                  <a:graphicFrameLocks xmlns:a="http://schemas.openxmlformats.org/drawingml/2006/main"/>
+                </wp:cNvGraphicFramePr>
+                <a:graphic xmlns:a="http://schemas.openxmlformats.org/drawingml/2006/main">
+                  <a:graphicData uri="http://schemas.microsoft.com/office/word/2010/wordprocessingShape">
+                    <wps:wsp>
+                      <wps:cNvSpPr txBox="1">
+                        <a:spLocks noChangeArrowheads="1"/>
+                      </wps:cNvSpPr>
+                      <wps:spPr bwMode="auto">
+                        <a:xfrm>
+                          <a:off x="0" y="0"/>
+                          <a:ext cx="952500" cy="312420"/>
+                        </a:xfrm>
+                        <a:prstGeom prst="rect">
+                          <a:avLst/>
+                        </a:prstGeom>
+                        <a:solidFill>
+                          <a:srgbClr val="FFFFFF"/>
+                        </a:solidFill>
+                        <a:ln w="9525">
+                          <a:solidFill>
+                            <a:srgbClr val="000000"/>
+                          </a:solidFill>
+                          <a:miter lim="800000"/>
+                          <a:headEnd/>
+                          <a:tailEnd/>
+                        </a:ln>
+                      </wps:spPr>
+                      <wps:txbx>
+                        <w:txbxContent>
+                          <w:p>
+                            <w:r>
+                              <w:t>Mary Grey</w:t>
+                            </w:r>
+                          </w:p>
+                        </w:txbxContent>
+                      </wps:txbx>
+                      <wps:bodyPr rot="0" vert="horz" wrap="square" lIns="91440" tIns="45720" rIns="91440" bIns="45720" anchor="t" anchorCtr="0">
+                        <a:noAutofit/>
+                      </wps:bodyPr>
+                    </wps:wsp>
+                  </a:graphicData>
+                </a:graphic>
+                <wp14:sizeRelH relativeFrom="margin">
+                  <wp14:pctWidth>0</wp14:pctWidth>
+                </wp14:sizeRelH>
+                <wp14:sizeRelV relativeFrom="margin">
+                  <wp14:pctHeight>0</wp14:pctHeight>
+                </wp14:sizeRelV>
+              </wp:anchor>
+            </w:drawing>
+          </mc:Choice>
+          <mc:Fallback>
+            <w:pict>
+              <v:shape w14:anchorId="69D21C0E" id="_x0000_s1032" type="#_x0000_t202" style="position:absolute;margin-left:388.8pt;margin-top:167.25pt;width:75pt;height:24.6pt;z-index:251707392;visibility:visible;mso-wrap-style:square;mso-width-percent:0;mso-height-percent:0;mso-wrap-distance-left:9pt;mso-wrap-distance-top:3.6pt;mso-wrap-distance-right:9pt;mso-wrap-distance-bottom:3.6pt;mso-position-horizontal:absolute;mso-position-horizontal-relative:text;mso-position-vertical:absolute;mso-position-vertical-relative:text;mso-width-percent:0;mso-height-percent:0;mso-width-relative:margin;mso-height-relative:margin;v-text-anchor:top" o:gfxdata="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">
+                <v:textbox>
+                  <w:txbxContent>
+                    <w:p>
+                      <w:r>
+                        <w:t>Mary Grey</w:t>
+                      </w:r>
+                    </w:p>
+                  </w:txbxContent>
+                </v:textbox>
+                <w10:wrap type="square"/>
+              </v:shape>
+            </w:pict>
+          </mc:Fallback>
+        </mc:AlternateContent>
+      </w:r>
+      <w:r>
+        <w:rPr>
+          <w:noProof/>
+        </w:rPr>
+        <mc:AlternateContent>
+          <mc:Choice Requires="wps">
+            <w:drawing>
+              <wp:anchor distT="45720" distB="45720" distL="114300" distR="114300" simplePos="0" relativeHeight="251705344" behindDoc="0" locked="0" layoutInCell="1" allowOverlap="1" wp14:anchorId="243769D3" wp14:editId="5738799A">
+                <wp:simplePos x="0" y="0"/>
+                <wp:positionH relativeFrom="column">
+                  <wp:posOffset>3924300</wp:posOffset>
+                </wp:positionH>
+                <wp:positionV relativeFrom="paragraph">
+                  <wp:posOffset>2108835</wp:posOffset>
                 </wp:positionV>
                 <wp:extent cx="845820" cy="518160"/>
                 <wp:effectExtent l="0" t="0" r="11430" b="15240"/>
@@ -514,14 +2215,12 @@
                       <wps:txbx>
                         <w:txbxContent>
                           <w:p>
-                            <w:proofErr w:type="spellStart"/>
                             <w:r>
                               <w:t>Katherine</w:t>
                             </w:r>
                             <w:r>
                               <w:t>Grey</w:t>
                             </w:r>
-                            <w:proofErr w:type="spellEnd"/>
                           </w:p>
                         </w:txbxContent>
                       </wps:txbx>
@@ -542,18 +2241,16 @@
           </mc:Choice>
           <mc:Fallback>
             <w:pict>
-              <v:shape w14:anchorId="243769D3" id="_x0000_s1027" type="#_x0000_t202" style="position:absolute;margin-left:351pt;margin-top:161.85pt;width:66.6pt;height:40.8pt;z-index:251705344;visibility:visible;mso-wrap-style:square;mso-width-percent:0;mso-height-percent:0;mso-wrap-distance-left:9pt;mso-wrap-distance-top:3.6pt;mso-wrap-distance-right:9pt;mso-wrap-distance-bottom:3.6pt;mso-position-horizontal:absolute;mso-position-horizontal-relative:text;mso-position-vertical:absolute;mso-position-vertical-relative:text;mso-width-percent:0;mso-height-percent:0;mso-width-relative:margin;mso-height-relative:margin;v-text-anchor:top" o:gfxdata="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">
+              <v:shape w14:anchorId="243769D3" id="_x0000_s1033" type="#_x0000_t202" style="position:absolute;margin-left:309pt;margin-top:166.05pt;width:66.6pt;height:40.8pt;z-index:251705344;visibility:visible;mso-wrap-style:square;mso-width-percent:0;mso-height-percent:0;mso-wrap-distance-left:9pt;mso-wrap-distance-top:3.6pt;mso-wrap-distance-right:9pt;mso-wrap-distance-bottom:3.6pt;mso-position-horizontal:absolute;mso-position-horizontal-relative:text;mso-position-vertical:absolute;mso-position-vertical-relative:text;mso-width-percent:0;mso-height-percent:0;mso-width-relative:margin;mso-height-relative:margin;v-text-anchor:top" o:gfxdata="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">
                 <v:textbox>
                   <w:txbxContent>
                     <w:p>
-                      <w:proofErr w:type="spellStart"/>
                       <w:r>
                         <w:t>Katherine</w:t>
                       </w:r>
                       <w:r>
                         <w:t>Grey</w:t>
                       </w:r>
-                      <w:proofErr w:type="spellEnd"/>
                     </w:p>
                   </w:txbxContent>
                 </v:textbox>
@@ -570,13 +2267,13 @@
         <mc:AlternateContent>
           <mc:Choice Requires="wps">
             <w:drawing>
-              <wp:anchor distT="45720" distB="45720" distL="114300" distR="114300" simplePos="0" relativeHeight="251703296" behindDoc="0" locked="0" layoutInCell="1" allowOverlap="1" wp14:anchorId="41949A88" wp14:editId="0CA14FE7">
+              <wp:anchor distT="45720" distB="45720" distL="114300" distR="114300" simplePos="0" relativeHeight="251703296" behindDoc="0" locked="0" layoutInCell="1" allowOverlap="1" wp14:anchorId="41949A88" wp14:editId="4C114FF5">
                 <wp:simplePos x="0" y="0"/>
                 <wp:positionH relativeFrom="column">
-                  <wp:posOffset>3398520</wp:posOffset>
+                  <wp:posOffset>2880360</wp:posOffset>
                 </wp:positionH>
                 <wp:positionV relativeFrom="paragraph">
-                  <wp:posOffset>2040255</wp:posOffset>
+                  <wp:posOffset>2093595</wp:posOffset>
                 </wp:positionV>
                 <wp:extent cx="845820" cy="335280"/>
                 <wp:effectExtent l="0" t="0" r="11430" b="26670"/>
@@ -637,102 +2334,12 @@
           </mc:Choice>
           <mc:Fallback>
             <w:pict>
-              <v:shape w14:anchorId="41949A88" id="_x0000_s1028" type="#_x0000_t202" style="position:absolute;margin-left:267.6pt;margin-top:160.65pt;width:66.6pt;height:26.4pt;z-index:251703296;visibility:visible;mso-wrap-style:square;mso-width-percent:0;mso-height-percent:0;mso-wrap-distance-left:9pt;mso-wrap-distance-top:3.6pt;mso-wrap-distance-right:9pt;mso-wrap-distance-bottom:3.6pt;mso-position-horizontal:absolute;mso-position-horizontal-relative:text;mso-position-vertical:absolute;mso-position-vertical-relative:text;mso-width-percent:0;mso-height-percent:0;mso-width-relative:margin;mso-height-relative:margin;v-text-anchor:top" o:gfxdata="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">
+              <v:shape w14:anchorId="41949A88" id="_x0000_s1034" type="#_x0000_t202" style="position:absolute;margin-left:226.8pt;margin-top:164.85pt;width:66.6pt;height:26.4pt;z-index:251703296;visibility:visible;mso-wrap-style:square;mso-width-percent:0;mso-height-percent:0;mso-wrap-distance-left:9pt;mso-wrap-distance-top:3.6pt;mso-wrap-distance-right:9pt;mso-wrap-distance-bottom:3.6pt;mso-position-horizontal:absolute;mso-position-horizontal-relative:text;mso-position-vertical:absolute;mso-position-vertical-relative:text;mso-width-percent:0;mso-height-percent:0;mso-width-relative:margin;mso-height-relative:margin;v-text-anchor:top" o:gfxdata="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">
                 <v:textbox>
                   <w:txbxContent>
                     <w:p>
                       <w:r>
                         <w:t>Jane Grey</w:t>
-                      </w:r>
-                    </w:p>
-                  </w:txbxContent>
-                </v:textbox>
-                <w10:wrap type="square"/>
-              </v:shape>
-            </w:pict>
-          </mc:Fallback>
-        </mc:AlternateContent>
-      </w:r>
-      <w:r>
-        <w:rPr>
-          <w:noProof/>
-        </w:rPr>
-        <mc:AlternateContent>
-          <mc:Choice Requires="wps">
-            <w:drawing>
-              <wp:anchor distT="45720" distB="45720" distL="114300" distR="114300" simplePos="0" relativeHeight="251701248" behindDoc="0" locked="0" layoutInCell="1" allowOverlap="1" wp14:anchorId="2F217765" wp14:editId="05FDC9DE">
-                <wp:simplePos x="0" y="0"/>
-                <wp:positionH relativeFrom="column">
-                  <wp:posOffset>3878580</wp:posOffset>
-                </wp:positionH>
-                <wp:positionV relativeFrom="paragraph">
-                  <wp:posOffset>965835</wp:posOffset>
-                </wp:positionV>
-                <wp:extent cx="1310640" cy="312420"/>
-                <wp:effectExtent l="0" t="0" r="22860" b="11430"/>
-                <wp:wrapSquare wrapText="bothSides"/>
-                <wp:docPr id="1978509818" name="Text Box 2"/>
-                <wp:cNvGraphicFramePr>
-                  <a:graphicFrameLocks xmlns:a="http://schemas.openxmlformats.org/drawingml/2006/main"/>
-                </wp:cNvGraphicFramePr>
-                <a:graphic xmlns:a="http://schemas.openxmlformats.org/drawingml/2006/main">
-                  <a:graphicData uri="http://schemas.microsoft.com/office/word/2010/wordprocessingShape">
-                    <wps:wsp>
-                      <wps:cNvSpPr txBox="1">
-                        <a:spLocks noChangeArrowheads="1"/>
-                      </wps:cNvSpPr>
-                      <wps:spPr bwMode="auto">
-                        <a:xfrm>
-                          <a:off x="0" y="0"/>
-                          <a:ext cx="1310640" cy="312420"/>
-                        </a:xfrm>
-                        <a:prstGeom prst="rect">
-                          <a:avLst/>
-                        </a:prstGeom>
-                        <a:solidFill>
-                          <a:srgbClr val="FFFFFF"/>
-                        </a:solidFill>
-                        <a:ln w="9525">
-                          <a:solidFill>
-                            <a:srgbClr val="000000"/>
-                          </a:solidFill>
-                          <a:miter lim="800000"/>
-                          <a:headEnd/>
-                          <a:tailEnd/>
-                        </a:ln>
-                      </wps:spPr>
-                      <wps:txbx>
-                        <w:txbxContent>
-                          <w:p>
-                            <w:r>
-                              <w:t>Frances Brandon</w:t>
-                            </w:r>
-                          </w:p>
-                        </w:txbxContent>
-                      </wps:txbx>
-                      <wps:bodyPr rot="0" vert="horz" wrap="square" lIns="91440" tIns="45720" rIns="91440" bIns="45720" anchor="t" anchorCtr="0">
-                        <a:noAutofit/>
-                      </wps:bodyPr>
-                    </wps:wsp>
-                  </a:graphicData>
-                </a:graphic>
-                <wp14:sizeRelH relativeFrom="margin">
-                  <wp14:pctWidth>0</wp14:pctWidth>
-                </wp14:sizeRelH>
-                <wp14:sizeRelV relativeFrom="margin">
-                  <wp14:pctHeight>0</wp14:pctHeight>
-                </wp14:sizeRelV>
-              </wp:anchor>
-            </w:drawing>
-          </mc:Choice>
-          <mc:Fallback>
-            <w:pict>
-              <v:shape w14:anchorId="2F217765" id="_x0000_s1029" type="#_x0000_t202" style="position:absolute;margin-left:305.4pt;margin-top:76.05pt;width:103.2pt;height:24.6pt;z-index:251701248;visibility:visible;mso-wrap-style:square;mso-width-percent:0;mso-height-percent:0;mso-wrap-distance-left:9pt;mso-wrap-distance-top:3.6pt;mso-wrap-distance-right:9pt;mso-wrap-distance-bottom:3.6pt;mso-position-horizontal:absolute;mso-position-horizontal-relative:text;mso-position-vertical:absolute;mso-position-vertical-relative:text;mso-width-percent:0;mso-height-percent:0;mso-width-relative:margin;mso-height-relative:margin;v-text-anchor:top" o:gfxdata="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">
-                <v:textbox>
-                  <w:txbxContent>
-                    <w:p>
-                      <w:r>
-                        <w:t>Frances Brandon</w:t>
                       </w:r>
                     </w:p>
                   </w:txbxContent>
@@ -1124,7 +2731,17 @@
                       <wps:txbx>
                         <w:txbxContent>
                           <w:p>
+                            <w:pPr>
+                              <w:rPr>
+                                <w:b/>
+                                <w:bCs/>
+                              </w:rPr>
+                            </w:pPr>
                             <w:r>
+                              <w:rPr>
+                                <w:b/>
+                                <w:bCs/>
+                              </w:rPr>
                               <w:t>Elizabeth I</w:t>
                             </w:r>
                           </w:p>
@@ -1147,11 +2764,21 @@
           </mc:Choice>
           <mc:Fallback>
             <w:pict>
-              <v:shape w14:anchorId="48F7AD48" id="_x0000_s1030" type="#_x0000_t202" style="position:absolute;margin-left:159.6pt;margin-top:106.65pt;width:1in;height:25.8pt;z-index:251688960;visibility:visible;mso-wrap-style:square;mso-width-percent:0;mso-height-percent:0;mso-wrap-distance-left:9pt;mso-wrap-distance-top:3.6pt;mso-wrap-distance-right:9pt;mso-wrap-distance-bottom:3.6pt;mso-position-horizontal:absolute;mso-position-horizontal-relative:text;mso-position-vertical:absolute;mso-position-vertical-relative:text;mso-width-percent:0;mso-height-percent:0;mso-width-relative:margin;mso-height-relative:margin;v-text-anchor:top" o:gfxdata="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">
+              <v:shape w14:anchorId="48F7AD48" id="_x0000_s1035" type="#_x0000_t202" style="position:absolute;margin-left:159.6pt;margin-top:106.65pt;width:1in;height:25.8pt;z-index:251688960;visibility:visible;mso-wrap-style:square;mso-width-percent:0;mso-height-percent:0;mso-wrap-distance-left:9pt;mso-wrap-distance-top:3.6pt;mso-wrap-distance-right:9pt;mso-wrap-distance-bottom:3.6pt;mso-position-horizontal:absolute;mso-position-horizontal-relative:text;mso-position-vertical:absolute;mso-position-vertical-relative:text;mso-width-percent:0;mso-height-percent:0;mso-width-relative:margin;mso-height-relative:margin;v-text-anchor:top" o:gfxdata="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">
                 <v:textbox>
                   <w:txbxContent>
                     <w:p>
+                      <w:pPr>
+                        <w:rPr>
+                          <w:b/>
+                          <w:bCs/>
+                        </w:rPr>
+                      </w:pPr>
                       <w:r>
+                        <w:rPr>
+                          <w:b/>
+                          <w:bCs/>
+                        </w:rPr>
                         <w:t>Elizabeth I</w:t>
                       </w:r>
                     </w:p>
@@ -1214,7 +2841,17 @@
                       <wps:txbx>
                         <w:txbxContent>
                           <w:p>
+                            <w:pPr>
+                              <w:rPr>
+                                <w:b/>
+                                <w:bCs/>
+                              </w:rPr>
+                            </w:pPr>
                             <w:r>
+                              <w:rPr>
+                                <w:b/>
+                                <w:bCs/>
+                              </w:rPr>
                               <w:t>Edward VI</w:t>
                             </w:r>
                           </w:p>
@@ -1237,11 +2874,21 @@
           </mc:Choice>
           <mc:Fallback>
             <w:pict>
-              <v:shape w14:anchorId="395A186A" id="_x0000_s1031" type="#_x0000_t202" style="position:absolute;margin-left:241.2pt;margin-top:106.05pt;width:73.8pt;height:27pt;z-index:251691008;visibility:visible;mso-wrap-style:square;mso-width-percent:0;mso-height-percent:0;mso-wrap-distance-left:9pt;mso-wrap-distance-top:3.6pt;mso-wrap-distance-right:9pt;mso-wrap-distance-bottom:3.6pt;mso-position-horizontal:absolute;mso-position-horizontal-relative:text;mso-position-vertical:absolute;mso-position-vertical-relative:text;mso-width-percent:0;mso-height-percent:0;mso-width-relative:margin;mso-height-relative:margin;v-text-anchor:top" o:gfxdata="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">
+              <v:shape w14:anchorId="395A186A" id="_x0000_s1036" type="#_x0000_t202" style="position:absolute;margin-left:241.2pt;margin-top:106.05pt;width:73.8pt;height:27pt;z-index:251691008;visibility:visible;mso-wrap-style:square;mso-width-percent:0;mso-height-percent:0;mso-wrap-distance-left:9pt;mso-wrap-distance-top:3.6pt;mso-wrap-distance-right:9pt;mso-wrap-distance-bottom:3.6pt;mso-position-horizontal:absolute;mso-position-horizontal-relative:text;mso-position-vertical:absolute;mso-position-vertical-relative:text;mso-width-percent:0;mso-height-percent:0;mso-width-relative:margin;mso-height-relative:margin;v-text-anchor:top" o:gfxdata="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">
                 <v:textbox>
                   <w:txbxContent>
                     <w:p>
+                      <w:pPr>
+                        <w:rPr>
+                          <w:b/>
+                          <w:bCs/>
+                        </w:rPr>
+                      </w:pPr>
                       <w:r>
+                        <w:rPr>
+                          <w:b/>
+                          <w:bCs/>
+                        </w:rPr>
                         <w:t>Edward VI</w:t>
                       </w:r>
                     </w:p>
@@ -1304,7 +2951,17 @@
                       <wps:txbx>
                         <w:txbxContent>
                           <w:p>
+                            <w:pPr>
+                              <w:rPr>
+                                <w:b/>
+                                <w:bCs/>
+                              </w:rPr>
+                            </w:pPr>
                             <w:r>
+                              <w:rPr>
+                                <w:b/>
+                                <w:bCs/>
+                              </w:rPr>
                               <w:t>Mary I</w:t>
                             </w:r>
                           </w:p>
@@ -1327,11 +2984,21 @@
           </mc:Choice>
           <mc:Fallback>
             <w:pict>
-              <v:shape w14:anchorId="083C2CD8" id="_x0000_s1032" type="#_x0000_t202" style="position:absolute;margin-left:97.2pt;margin-top:106.05pt;width:50.4pt;height:27.6pt;z-index:251686912;visibility:visible;mso-wrap-style:square;mso-width-percent:0;mso-height-percent:0;mso-wrap-distance-left:9pt;mso-wrap-distance-top:3.6pt;mso-wrap-distance-right:9pt;mso-wrap-distance-bottom:3.6pt;mso-position-horizontal:absolute;mso-position-horizontal-relative:text;mso-position-vertical:absolute;mso-position-vertical-relative:text;mso-width-percent:0;mso-height-percent:0;mso-width-relative:margin;mso-height-relative:margin;v-text-anchor:top" o:gfxdata="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">
+              <v:shape w14:anchorId="083C2CD8" id="_x0000_s1037" type="#_x0000_t202" style="position:absolute;margin-left:97.2pt;margin-top:106.05pt;width:50.4pt;height:27.6pt;z-index:251686912;visibility:visible;mso-wrap-style:square;mso-width-percent:0;mso-height-percent:0;mso-wrap-distance-left:9pt;mso-wrap-distance-top:3.6pt;mso-wrap-distance-right:9pt;mso-wrap-distance-bottom:3.6pt;mso-position-horizontal:absolute;mso-position-horizontal-relative:text;mso-position-vertical:absolute;mso-position-vertical-relative:text;mso-width-percent:0;mso-height-percent:0;mso-width-relative:margin;mso-height-relative:margin;v-text-anchor:top" o:gfxdata="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">
                 <v:textbox>
                   <w:txbxContent>
                     <w:p>
+                      <w:pPr>
+                        <w:rPr>
+                          <w:b/>
+                          <w:bCs/>
+                        </w:rPr>
+                      </w:pPr>
                       <w:r>
+                        <w:rPr>
+                          <w:b/>
+                          <w:bCs/>
+                        </w:rPr>
                         <w:t>Mary I</w:t>
                       </w:r>
                     </w:p>
@@ -1350,7 +3017,7 @@
         <mc:AlternateContent>
           <mc:Choice Requires="wps">
             <w:drawing>
-              <wp:anchor distT="0" distB="0" distL="114300" distR="114300" simplePos="0" relativeHeight="251684864" behindDoc="0" locked="0" layoutInCell="1" allowOverlap="1" wp14:anchorId="4CF67296" wp14:editId="163C6E52">
+              <wp:anchor distT="0" distB="0" distL="114300" distR="114300" simplePos="0" relativeHeight="251684864" behindDoc="0" locked="0" layoutInCell="1" allowOverlap="1" wp14:anchorId="4CF67296" wp14:editId="0FE41264">
                 <wp:simplePos x="0" y="0"/>
                 <wp:positionH relativeFrom="column">
                   <wp:posOffset>487680</wp:posOffset>
@@ -1378,13 +3045,13 @@
                       </wps:spPr>
                       <wps:style>
                         <a:lnRef idx="2">
-                          <a:schemeClr val="accent1"/>
+                          <a:schemeClr val="dk1"/>
                         </a:lnRef>
                         <a:fillRef idx="0">
-                          <a:schemeClr val="accent1"/>
+                          <a:schemeClr val="dk1"/>
                         </a:fillRef>
                         <a:effectRef idx="1">
-                          <a:schemeClr val="accent1"/>
+                          <a:schemeClr val="dk1"/>
                         </a:effectRef>
                         <a:fontRef idx="minor">
                           <a:schemeClr val="tx1"/>
@@ -1405,7 +3072,7 @@
           </mc:Choice>
           <mc:Fallback>
             <w:pict>
-              <v:line w14:anchorId="693F7D70" id="Straight Connector 16" o:spid="_x0000_s1026" style="position:absolute;z-index:251684864;visibility:visible;mso-wrap-style:square;mso-width-percent:0;mso-height-percent:0;mso-wrap-distance-left:9pt;mso-wrap-distance-top:0;mso-wrap-distance-right:9pt;mso-wrap-distance-bottom:0;mso-position-horizontal:absolute;mso-position-horizontal-relative:text;mso-position-vertical:absolute;mso-position-vertical-relative:text;mso-width-percent:0;mso-height-percent:0;mso-width-relative:margin;mso-height-relative:margin" from="38.4pt,176.25pt" to="39pt,198.45pt" o:gfxdata="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" strokecolor="#156082 [3204]" strokeweight="1.5pt">
+              <v:line w14:anchorId="46317211" id="Straight Connector 16" o:spid="_x0000_s1026" style="position:absolute;z-index:251684864;visibility:visible;mso-wrap-style:square;mso-width-percent:0;mso-height-percent:0;mso-wrap-distance-left:9pt;mso-wrap-distance-top:0;mso-wrap-distance-right:9pt;mso-wrap-distance-bottom:0;mso-position-horizontal:absolute;mso-position-horizontal-relative:text;mso-position-vertical:absolute;mso-position-vertical-relative:text;mso-width-percent:0;mso-height-percent:0;mso-width-relative:margin;mso-height-relative:margin" from="38.4pt,176.25pt" to="39pt,198.45pt" o:gfxdata="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" strokecolor="black [3200]" strokeweight="1.5pt">
                 <v:stroke joinstyle="miter"/>
               </v:line>
             </w:pict>
@@ -1468,7 +3135,17 @@
                             </w:r>
                           </w:p>
                           <w:p>
+                            <w:pPr>
+                              <w:rPr>
+                                <w:b/>
+                                <w:bCs/>
+                              </w:rPr>
+                            </w:pPr>
                             <w:r>
+                              <w:rPr>
+                                <w:b/>
+                                <w:bCs/>
+                              </w:rPr>
                               <w:t>James I of England</w:t>
                             </w:r>
                           </w:p>
@@ -1491,7 +3168,7 @@
           </mc:Choice>
           <mc:Fallback>
             <w:pict>
-              <v:shape w14:anchorId="28B9E53D" id="_x0000_s1033" type="#_x0000_t202" style="position:absolute;margin-left:-42pt;margin-top:196.65pt;width:145.8pt;height:48pt;z-index:251683840;visibility:visible;mso-wrap-style:square;mso-width-percent:0;mso-height-percent:0;mso-wrap-distance-left:9pt;mso-wrap-distance-top:3.6pt;mso-wrap-distance-right:9pt;mso-wrap-distance-bottom:3.6pt;mso-position-horizontal:absolute;mso-position-horizontal-relative:text;mso-position-vertical:absolute;mso-position-vertical-relative:text;mso-width-percent:0;mso-height-percent:0;mso-width-relative:margin;mso-height-relative:margin;v-text-anchor:top" o:gfxdata="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">
+              <v:shape w14:anchorId="28B9E53D" id="_x0000_s1038" type="#_x0000_t202" style="position:absolute;margin-left:-42pt;margin-top:196.65pt;width:145.8pt;height:48pt;z-index:251683840;visibility:visible;mso-wrap-style:square;mso-width-percent:0;mso-height-percent:0;mso-wrap-distance-left:9pt;mso-wrap-distance-top:3.6pt;mso-wrap-distance-right:9pt;mso-wrap-distance-bottom:3.6pt;mso-position-horizontal:absolute;mso-position-horizontal-relative:text;mso-position-vertical:absolute;mso-position-vertical-relative:text;mso-width-percent:0;mso-height-percent:0;mso-width-relative:margin;mso-height-relative:margin;v-text-anchor:top" o:gfxdata="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">
                 <v:textbox>
                   <w:txbxContent>
                     <w:p>
@@ -1500,7 +3177,17 @@
                       </w:r>
                     </w:p>
                     <w:p>
+                      <w:pPr>
+                        <w:rPr>
+                          <w:b/>
+                          <w:bCs/>
+                        </w:rPr>
+                      </w:pPr>
                       <w:r>
+                        <w:rPr>
+                          <w:b/>
+                          <w:bCs/>
+                        </w:rPr>
                         <w:t>James I of England</w:t>
                       </w:r>
                     </w:p>
@@ -1655,7 +3342,7 @@
           </mc:Choice>
           <mc:Fallback>
             <w:pict>
-              <v:shape w14:anchorId="13F73173" id="_x0000_s1034" type="#_x0000_t202" style="position:absolute;margin-left:-43.2pt;margin-top:148.65pt;width:128.4pt;height:28.2pt;z-index:251680768;visibility:visible;mso-wrap-style:square;mso-width-percent:0;mso-height-percent:0;mso-wrap-distance-left:9pt;mso-wrap-distance-top:3.6pt;mso-wrap-distance-right:9pt;mso-wrap-distance-bottom:3.6pt;mso-position-horizontal:absolute;mso-position-horizontal-relative:text;mso-position-vertical:absolute;mso-position-vertical-relative:text;mso-width-percent:0;mso-height-percent:0;mso-width-relative:margin;mso-height-relative:margin;v-text-anchor:top" o:gfxdata="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">
+              <v:shape w14:anchorId="13F73173" id="_x0000_s1039" type="#_x0000_t202" style="position:absolute;margin-left:-43.2pt;margin-top:148.65pt;width:128.4pt;height:28.2pt;z-index:251680768;visibility:visible;mso-wrap-style:square;mso-width-percent:0;mso-height-percent:0;mso-wrap-distance-left:9pt;mso-wrap-distance-top:3.6pt;mso-wrap-distance-right:9pt;mso-wrap-distance-bottom:3.6pt;mso-position-horizontal:absolute;mso-position-horizontal-relative:text;mso-position-vertical:absolute;mso-position-vertical-relative:text;mso-width-percent:0;mso-height-percent:0;mso-width-relative:margin;mso-height-relative:margin;v-text-anchor:top" o:gfxdata="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">
                 <v:textbox>
                   <w:txbxContent>
                     <w:p>
@@ -1745,7 +3432,7 @@
           </mc:Choice>
           <mc:Fallback>
             <w:pict>
-              <v:shape w14:anchorId="4C3C2B72" id="_x0000_s1035" type="#_x0000_t202" style="position:absolute;margin-left:-44.4pt;margin-top:94.05pt;width:128.4pt;height:25.8pt;z-index:251677696;visibility:visible;mso-wrap-style:square;mso-width-percent:0;mso-height-percent:0;mso-wrap-distance-left:9pt;mso-wrap-distance-top:3.6pt;mso-wrap-distance-right:9pt;mso-wrap-distance-bottom:3.6pt;mso-position-horizontal:absolute;mso-position-horizontal-relative:text;mso-position-vertical:absolute;mso-position-vertical-relative:text;mso-width-percent:0;mso-height-percent:0;mso-width-relative:margin;mso-height-relative:margin;v-text-anchor:top" o:gfxdata="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">
+              <v:shape w14:anchorId="4C3C2B72" id="_x0000_s1040" type="#_x0000_t202" style="position:absolute;margin-left:-44.4pt;margin-top:94.05pt;width:128.4pt;height:25.8pt;z-index:251677696;visibility:visible;mso-wrap-style:square;mso-width-percent:0;mso-height-percent:0;mso-wrap-distance-left:9pt;mso-wrap-distance-top:3.6pt;mso-wrap-distance-right:9pt;mso-wrap-distance-bottom:3.6pt;mso-position-horizontal:absolute;mso-position-horizontal-relative:text;mso-position-vertical:absolute;mso-position-vertical-relative:text;mso-width-percent:0;mso-height-percent:0;mso-width-relative:margin;mso-height-relative:margin;v-text-anchor:top" o:gfxdata="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">
                 <v:textbox>
                   <w:txbxContent>
                     <w:p>
@@ -1761,6 +3448,8 @@
           </mc:Fallback>
         </mc:AlternateContent>
       </w:r>
+    </w:p>
+    <w:p>
       <w:r>
         <w:rPr>
           <w:noProof/>
@@ -1768,415 +3457,18 @@
         <mc:AlternateContent>
           <mc:Choice Requires="wps">
             <w:drawing>
-              <wp:anchor distT="0" distB="0" distL="114300" distR="114300" simplePos="0" relativeHeight="251678720" behindDoc="0" locked="0" layoutInCell="1" allowOverlap="1" wp14:anchorId="4089B572" wp14:editId="3FD439BE">
+              <wp:anchor distT="45720" distB="45720" distL="114300" distR="114300" simplePos="0" relativeHeight="251666432" behindDoc="0" locked="0" layoutInCell="1" allowOverlap="1" wp14:anchorId="3BDF370E" wp14:editId="523F7C20">
                 <wp:simplePos x="0" y="0"/>
                 <wp:positionH relativeFrom="column">
-                  <wp:posOffset>457200</wp:posOffset>
+                  <wp:posOffset>68580</wp:posOffset>
                 </wp:positionH>
                 <wp:positionV relativeFrom="paragraph">
-                  <wp:posOffset>821055</wp:posOffset>
+                  <wp:posOffset>207010</wp:posOffset>
                 </wp:positionV>
-                <wp:extent cx="0" cy="358140"/>
-                <wp:effectExtent l="0" t="0" r="38100" b="22860"/>
-                <wp:wrapNone/>
-                <wp:docPr id="1801945019" name="Straight Connector 14"/>
-                <wp:cNvGraphicFramePr/>
-                <a:graphic xmlns:a="http://schemas.openxmlformats.org/drawingml/2006/main">
-                  <a:graphicData uri="http://schemas.microsoft.com/office/word/2010/wordprocessingShape">
-                    <wps:wsp>
-                      <wps:cNvCnPr/>
-                      <wps:spPr>
-                        <a:xfrm>
-                          <a:off x="0" y="0"/>
-                          <a:ext cx="0" cy="358140"/>
-                        </a:xfrm>
-                        <a:prstGeom prst="line">
-                          <a:avLst/>
-                        </a:prstGeom>
-                      </wps:spPr>
-                      <wps:style>
-                        <a:lnRef idx="2">
-                          <a:schemeClr val="dk1"/>
-                        </a:lnRef>
-                        <a:fillRef idx="0">
-                          <a:schemeClr val="dk1"/>
-                        </a:fillRef>
-                        <a:effectRef idx="1">
-                          <a:schemeClr val="dk1"/>
-                        </a:effectRef>
-                        <a:fontRef idx="minor">
-                          <a:schemeClr val="tx1"/>
-                        </a:fontRef>
-                      </wps:style>
-                      <wps:bodyPr/>
-                    </wps:wsp>
-                  </a:graphicData>
-                </a:graphic>
-              </wp:anchor>
-            </w:drawing>
-          </mc:Choice>
-          <mc:Fallback>
-            <w:pict>
-              <v:line w14:anchorId="7C090FB0" id="Straight Connector 14" o:spid="_x0000_s1026" style="position:absolute;z-index:251678720;visibility:visible;mso-wrap-style:square;mso-wrap-distance-left:9pt;mso-wrap-distance-top:0;mso-wrap-distance-right:9pt;mso-wrap-distance-bottom:0;mso-position-horizontal:absolute;mso-position-horizontal-relative:text;mso-position-vertical:absolute;mso-position-vertical-relative:text" from="36pt,64.65pt" to="36pt,92.85pt" o:gfxdata="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" strokecolor="black [3200]" strokeweight="1.5pt">
-                <v:stroke joinstyle="miter"/>
-              </v:line>
-            </w:pict>
-          </mc:Fallback>
-        </mc:AlternateContent>
-      </w:r>
-      <w:r>
-        <w:rPr>
-          <w:noProof/>
-        </w:rPr>
-        <mc:AlternateContent>
-          <mc:Choice Requires="wps">
-            <w:drawing>
-              <wp:anchor distT="0" distB="0" distL="114300" distR="114300" simplePos="0" relativeHeight="251675648" behindDoc="0" locked="0" layoutInCell="1" allowOverlap="1" wp14:anchorId="352BA431" wp14:editId="3ACDF074">
-                <wp:simplePos x="0" y="0"/>
-                <wp:positionH relativeFrom="column">
-                  <wp:posOffset>2324100</wp:posOffset>
-                </wp:positionH>
-                <wp:positionV relativeFrom="paragraph">
-                  <wp:posOffset>325755</wp:posOffset>
-                </wp:positionV>
-                <wp:extent cx="7620" cy="243840"/>
-                <wp:effectExtent l="0" t="0" r="30480" b="22860"/>
-                <wp:wrapNone/>
-                <wp:docPr id="1644916176" name="Straight Connector 12"/>
-                <wp:cNvGraphicFramePr/>
-                <a:graphic xmlns:a="http://schemas.openxmlformats.org/drawingml/2006/main">
-                  <a:graphicData uri="http://schemas.microsoft.com/office/word/2010/wordprocessingShape">
-                    <wps:wsp>
-                      <wps:cNvCnPr/>
-                      <wps:spPr>
-                        <a:xfrm>
-                          <a:off x="0" y="0"/>
-                          <a:ext cx="7620" cy="243840"/>
-                        </a:xfrm>
-                        <a:prstGeom prst="line">
-                          <a:avLst/>
-                        </a:prstGeom>
-                      </wps:spPr>
-                      <wps:style>
-                        <a:lnRef idx="2">
-                          <a:schemeClr val="dk1"/>
-                        </a:lnRef>
-                        <a:fillRef idx="0">
-                          <a:schemeClr val="dk1"/>
-                        </a:fillRef>
-                        <a:effectRef idx="1">
-                          <a:schemeClr val="dk1"/>
-                        </a:effectRef>
-                        <a:fontRef idx="minor">
-                          <a:schemeClr val="tx1"/>
-                        </a:fontRef>
-                      </wps:style>
-                      <wps:bodyPr/>
-                    </wps:wsp>
-                  </a:graphicData>
-                </a:graphic>
-              </wp:anchor>
-            </w:drawing>
-          </mc:Choice>
-          <mc:Fallback>
-            <w:pict>
-              <v:line w14:anchorId="594F8B7B" id="Straight Connector 12" o:spid="_x0000_s1026" style="position:absolute;z-index:251675648;visibility:visible;mso-wrap-style:square;mso-wrap-distance-left:9pt;mso-wrap-distance-top:0;mso-wrap-distance-right:9pt;mso-wrap-distance-bottom:0;mso-position-horizontal:absolute;mso-position-horizontal-relative:text;mso-position-vertical:absolute;mso-position-vertical-relative:text" from="183pt,25.65pt" to="183.6pt,44.85pt" o:gfxdata="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" strokecolor="black [3200]" strokeweight="1.5pt">
-                <v:stroke joinstyle="miter"/>
-              </v:line>
-            </w:pict>
-          </mc:Fallback>
-        </mc:AlternateContent>
-      </w:r>
-      <w:r>
-        <w:rPr>
-          <w:noProof/>
-        </w:rPr>
-        <mc:AlternateContent>
-          <mc:Choice Requires="wps">
-            <w:drawing>
-              <wp:anchor distT="0" distB="0" distL="114300" distR="114300" simplePos="0" relativeHeight="251671552" behindDoc="0" locked="0" layoutInCell="1" allowOverlap="1" wp14:anchorId="0629E74B" wp14:editId="6D9618D3">
-                <wp:simplePos x="0" y="0"/>
-                <wp:positionH relativeFrom="column">
-                  <wp:posOffset>449580</wp:posOffset>
-                </wp:positionH>
-                <wp:positionV relativeFrom="paragraph">
-                  <wp:posOffset>295275</wp:posOffset>
-                </wp:positionV>
-                <wp:extent cx="4038600" cy="53340"/>
-                <wp:effectExtent l="0" t="0" r="19050" b="22860"/>
-                <wp:wrapNone/>
-                <wp:docPr id="1264586758" name="Straight Connector 7"/>
-                <wp:cNvGraphicFramePr/>
-                <a:graphic xmlns:a="http://schemas.openxmlformats.org/drawingml/2006/main">
-                  <a:graphicData uri="http://schemas.microsoft.com/office/word/2010/wordprocessingShape">
-                    <wps:wsp>
-                      <wps:cNvCnPr/>
-                      <wps:spPr>
-                        <a:xfrm>
-                          <a:off x="0" y="0"/>
-                          <a:ext cx="4038600" cy="53340"/>
-                        </a:xfrm>
-                        <a:prstGeom prst="line">
-                          <a:avLst/>
-                        </a:prstGeom>
-                      </wps:spPr>
-                      <wps:style>
-                        <a:lnRef idx="2">
-                          <a:schemeClr val="dk1"/>
-                        </a:lnRef>
-                        <a:fillRef idx="0">
-                          <a:schemeClr val="dk1"/>
-                        </a:fillRef>
-                        <a:effectRef idx="1">
-                          <a:schemeClr val="dk1"/>
-                        </a:effectRef>
-                        <a:fontRef idx="minor">
-                          <a:schemeClr val="tx1"/>
-                        </a:fontRef>
-                      </wps:style>
-                      <wps:bodyPr/>
-                    </wps:wsp>
-                  </a:graphicData>
-                </a:graphic>
-                <wp14:sizeRelH relativeFrom="margin">
-                  <wp14:pctWidth>0</wp14:pctWidth>
-                </wp14:sizeRelH>
-                <wp14:sizeRelV relativeFrom="margin">
-                  <wp14:pctHeight>0</wp14:pctHeight>
-                </wp14:sizeRelV>
-              </wp:anchor>
-            </w:drawing>
-          </mc:Choice>
-          <mc:Fallback>
-            <w:pict>
-              <v:line w14:anchorId="7185A094" id="Straight Connector 7" o:spid="_x0000_s1026" style="position:absolute;z-index:251671552;visibility:visible;mso-wrap-style:square;mso-width-percent:0;mso-height-percent:0;mso-wrap-distance-left:9pt;mso-wrap-distance-top:0;mso-wrap-distance-right:9pt;mso-wrap-distance-bottom:0;mso-position-horizontal:absolute;mso-position-horizontal-relative:text;mso-position-vertical:absolute;mso-position-vertical-relative:text;mso-width-percent:0;mso-height-percent:0;mso-width-relative:margin;mso-height-relative:margin" from="35.4pt,23.25pt" to="353.4pt,27.45pt" o:gfxdata="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" strokecolor="black [3200]" strokeweight="1.5pt">
-                <v:stroke joinstyle="miter"/>
-              </v:line>
-            </w:pict>
-          </mc:Fallback>
-        </mc:AlternateContent>
-      </w:r>
-      <w:r>
-        <w:rPr>
-          <w:noProof/>
-        </w:rPr>
-        <mc:AlternateContent>
-          <mc:Choice Requires="wps">
-            <w:drawing>
-              <wp:anchor distT="0" distB="0" distL="114300" distR="114300" simplePos="0" relativeHeight="251674624" behindDoc="0" locked="0" layoutInCell="1" allowOverlap="1" wp14:anchorId="0281504D" wp14:editId="6BA69BE8">
-                <wp:simplePos x="0" y="0"/>
-                <wp:positionH relativeFrom="column">
-                  <wp:posOffset>4472940</wp:posOffset>
-                </wp:positionH>
-                <wp:positionV relativeFrom="paragraph">
-                  <wp:posOffset>371475</wp:posOffset>
-                </wp:positionV>
-                <wp:extent cx="0" cy="228600"/>
-                <wp:effectExtent l="0" t="0" r="38100" b="19050"/>
-                <wp:wrapNone/>
-                <wp:docPr id="1570417294" name="Straight Connector 11"/>
-                <wp:cNvGraphicFramePr/>
-                <a:graphic xmlns:a="http://schemas.openxmlformats.org/drawingml/2006/main">
-                  <a:graphicData uri="http://schemas.microsoft.com/office/word/2010/wordprocessingShape">
-                    <wps:wsp>
-                      <wps:cNvCnPr/>
-                      <wps:spPr>
-                        <a:xfrm>
-                          <a:off x="0" y="0"/>
-                          <a:ext cx="0" cy="228600"/>
-                        </a:xfrm>
-                        <a:prstGeom prst="line">
-                          <a:avLst/>
-                        </a:prstGeom>
-                      </wps:spPr>
-                      <wps:style>
-                        <a:lnRef idx="2">
-                          <a:schemeClr val="dk1"/>
-                        </a:lnRef>
-                        <a:fillRef idx="0">
-                          <a:schemeClr val="dk1"/>
-                        </a:fillRef>
-                        <a:effectRef idx="1">
-                          <a:schemeClr val="dk1"/>
-                        </a:effectRef>
-                        <a:fontRef idx="minor">
-                          <a:schemeClr val="tx1"/>
-                        </a:fontRef>
-                      </wps:style>
-                      <wps:bodyPr/>
-                    </wps:wsp>
-                  </a:graphicData>
-                </a:graphic>
-              </wp:anchor>
-            </w:drawing>
-          </mc:Choice>
-          <mc:Fallback>
-            <w:pict>
-              <v:line w14:anchorId="7080ED33" id="Straight Connector 11" o:spid="_x0000_s1026" style="position:absolute;z-index:251674624;visibility:visible;mso-wrap-style:square;mso-wrap-distance-left:9pt;mso-wrap-distance-top:0;mso-wrap-distance-right:9pt;mso-wrap-distance-bottom:0;mso-position-horizontal:absolute;mso-position-horizontal-relative:text;mso-position-vertical:absolute;mso-position-vertical-relative:text" from="352.2pt,29.25pt" to="352.2pt,47.25pt" o:gfxdata="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" strokecolor="black [3200]" strokeweight="1.5pt">
-                <v:stroke joinstyle="miter"/>
-              </v:line>
-            </w:pict>
-          </mc:Fallback>
-        </mc:AlternateContent>
-      </w:r>
-      <w:r>
-        <w:rPr>
-          <w:noProof/>
-        </w:rPr>
-        <mc:AlternateContent>
-          <mc:Choice Requires="wps">
-            <w:drawing>
-              <wp:anchor distT="0" distB="0" distL="114300" distR="114300" simplePos="0" relativeHeight="251673600" behindDoc="0" locked="0" layoutInCell="1" allowOverlap="1" wp14:anchorId="7C267D79" wp14:editId="05E58057">
-                <wp:simplePos x="0" y="0"/>
-                <wp:positionH relativeFrom="margin">
-                  <wp:posOffset>441960</wp:posOffset>
-                </wp:positionH>
-                <wp:positionV relativeFrom="paragraph">
-                  <wp:posOffset>302895</wp:posOffset>
-                </wp:positionV>
-                <wp:extent cx="7620" cy="220980"/>
-                <wp:effectExtent l="0" t="0" r="30480" b="26670"/>
-                <wp:wrapNone/>
-                <wp:docPr id="1176422315" name="Straight Connector 4"/>
-                <wp:cNvGraphicFramePr/>
-                <a:graphic xmlns:a="http://schemas.openxmlformats.org/drawingml/2006/main">
-                  <a:graphicData uri="http://schemas.microsoft.com/office/word/2010/wordprocessingShape">
-                    <wps:wsp>
-                      <wps:cNvCnPr/>
-                      <wps:spPr>
-                        <a:xfrm>
-                          <a:off x="0" y="0"/>
-                          <a:ext cx="7620" cy="220980"/>
-                        </a:xfrm>
-                        <a:prstGeom prst="line">
-                          <a:avLst/>
-                        </a:prstGeom>
-                      </wps:spPr>
-                      <wps:style>
-                        <a:lnRef idx="2">
-                          <a:schemeClr val="dk1"/>
-                        </a:lnRef>
-                        <a:fillRef idx="0">
-                          <a:schemeClr val="dk1"/>
-                        </a:fillRef>
-                        <a:effectRef idx="1">
-                          <a:schemeClr val="dk1"/>
-                        </a:effectRef>
-                        <a:fontRef idx="minor">
-                          <a:schemeClr val="tx1"/>
-                        </a:fontRef>
-                      </wps:style>
-                      <wps:bodyPr/>
-                    </wps:wsp>
-                  </a:graphicData>
-                </a:graphic>
-                <wp14:sizeRelH relativeFrom="margin">
-                  <wp14:pctWidth>0</wp14:pctWidth>
-                </wp14:sizeRelH>
-                <wp14:sizeRelV relativeFrom="margin">
-                  <wp14:pctHeight>0</wp14:pctHeight>
-                </wp14:sizeRelV>
-              </wp:anchor>
-            </w:drawing>
-          </mc:Choice>
-          <mc:Fallback>
-            <w:pict>
-              <v:line w14:anchorId="61B2158C" id="Straight Connector 4" o:spid="_x0000_s1026" style="position:absolute;z-index:251673600;visibility:visible;mso-wrap-style:square;mso-width-percent:0;mso-height-percent:0;mso-wrap-distance-left:9pt;mso-wrap-distance-top:0;mso-wrap-distance-right:9pt;mso-wrap-distance-bottom:0;mso-position-horizontal:absolute;mso-position-horizontal-relative:margin;mso-position-vertical:absolute;mso-position-vertical-relative:text;mso-width-percent:0;mso-height-percent:0;mso-width-relative:margin;mso-height-relative:margin" from="34.8pt,23.85pt" to="35.4pt,41.25pt" o:gfxdata="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" strokecolor="black [3200]" strokeweight="1.5pt">
-                <v:stroke joinstyle="miter"/>
-                <w10:wrap anchorx="margin"/>
-              </v:line>
-            </w:pict>
-          </mc:Fallback>
-        </mc:AlternateContent>
-      </w:r>
-      <w:r>
-        <w:rPr>
-          <w:noProof/>
-        </w:rPr>
-        <mc:AlternateContent>
-          <mc:Choice Requires="wps">
-            <w:drawing>
-              <wp:anchor distT="0" distB="0" distL="114300" distR="114300" simplePos="0" relativeHeight="251663360" behindDoc="0" locked="0" layoutInCell="1" allowOverlap="1" wp14:anchorId="307B3EBA" wp14:editId="62F2BDB4">
-                <wp:simplePos x="0" y="0"/>
-                <wp:positionH relativeFrom="column">
-                  <wp:posOffset>2415540</wp:posOffset>
-                </wp:positionH>
-                <wp:positionV relativeFrom="paragraph">
-                  <wp:posOffset>59055</wp:posOffset>
-                </wp:positionV>
-                <wp:extent cx="0" cy="274320"/>
-                <wp:effectExtent l="0" t="0" r="38100" b="30480"/>
-                <wp:wrapNone/>
-                <wp:docPr id="677499438" name="Straight Connector 4"/>
-                <wp:cNvGraphicFramePr/>
-                <a:graphic xmlns:a="http://schemas.openxmlformats.org/drawingml/2006/main">
-                  <a:graphicData uri="http://schemas.microsoft.com/office/word/2010/wordprocessingShape">
-                    <wps:wsp>
-                      <wps:cNvCnPr/>
-                      <wps:spPr>
-                        <a:xfrm flipH="1">
-                          <a:off x="0" y="0"/>
-                          <a:ext cx="0" cy="274320"/>
-                        </a:xfrm>
-                        <a:prstGeom prst="line">
-                          <a:avLst/>
-                        </a:prstGeom>
-                      </wps:spPr>
-                      <wps:style>
-                        <a:lnRef idx="2">
-                          <a:schemeClr val="dk1"/>
-                        </a:lnRef>
-                        <a:fillRef idx="0">
-                          <a:schemeClr val="dk1"/>
-                        </a:fillRef>
-                        <a:effectRef idx="1">
-                          <a:schemeClr val="dk1"/>
-                        </a:effectRef>
-                        <a:fontRef idx="minor">
-                          <a:schemeClr val="tx1"/>
-                        </a:fontRef>
-                      </wps:style>
-                      <wps:bodyPr/>
-                    </wps:wsp>
-                  </a:graphicData>
-                </a:graphic>
-                <wp14:sizeRelH relativeFrom="margin">
-                  <wp14:pctWidth>0</wp14:pctWidth>
-                </wp14:sizeRelH>
-                <wp14:sizeRelV relativeFrom="margin">
-                  <wp14:pctHeight>0</wp14:pctHeight>
-                </wp14:sizeRelV>
-              </wp:anchor>
-            </w:drawing>
-          </mc:Choice>
-          <mc:Fallback>
-            <w:pict>
-              <v:line w14:anchorId="0B9FE3E2" id="Straight Connector 4" o:spid="_x0000_s1026" style="position:absolute;flip:x;z-index:251663360;visibility:visible;mso-wrap-style:square;mso-width-percent:0;mso-height-percent:0;mso-wrap-distance-left:9pt;mso-wrap-distance-top:0;mso-wrap-distance-right:9pt;mso-wrap-distance-bottom:0;mso-position-horizontal:absolute;mso-position-horizontal-relative:text;mso-position-vertical:absolute;mso-position-vertical-relative:text;mso-width-percent:0;mso-height-percent:0;mso-width-relative:margin;mso-height-relative:margin" from="190.2pt,4.65pt" to="190.2pt,26.25pt" o:gfxdata="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" strokecolor="black [3200]" strokeweight="1.5pt">
-                <v:stroke joinstyle="miter"/>
-              </v:line>
-            </w:pict>
-          </mc:Fallback>
-        </mc:AlternateContent>
-      </w:r>
-      <w:r>
-        <w:rPr>
-          <w:noProof/>
-        </w:rPr>
-        <mc:AlternateContent>
-          <mc:Choice Requires="wps">
-            <w:drawing>
-              <wp:anchor distT="45720" distB="45720" distL="114300" distR="114300" simplePos="0" relativeHeight="251670528" behindDoc="0" locked="0" layoutInCell="1" allowOverlap="1" wp14:anchorId="08D726C4" wp14:editId="6DD27B05">
-                <wp:simplePos x="0" y="0"/>
-                <wp:positionH relativeFrom="column">
-                  <wp:posOffset>4221480</wp:posOffset>
-                </wp:positionH>
-                <wp:positionV relativeFrom="paragraph">
-                  <wp:posOffset>577215</wp:posOffset>
-                </wp:positionV>
-                <wp:extent cx="609600" cy="312420"/>
-                <wp:effectExtent l="0" t="0" r="19050" b="11430"/>
+                <wp:extent cx="800100" cy="304800"/>
+                <wp:effectExtent l="0" t="0" r="19050" b="19050"/>
                 <wp:wrapSquare wrapText="bothSides"/>
-                <wp:docPr id="1390293869" name="Text Box 2"/>
+                <wp:docPr id="1890870519" name="Text Box 2"/>
                 <wp:cNvGraphicFramePr>
                   <a:graphicFrameLocks xmlns:a="http://schemas.openxmlformats.org/drawingml/2006/main"/>
                 </wp:cNvGraphicFramePr>
@@ -2189,7 +3481,7 @@
                       <wps:spPr bwMode="auto">
                         <a:xfrm>
                           <a:off x="0" y="0"/>
-                          <a:ext cx="609600" cy="312420"/>
+                          <a:ext cx="800100" cy="304800"/>
                         </a:xfrm>
                         <a:prstGeom prst="rect">
                           <a:avLst/>
@@ -2210,7 +3502,7 @@
                         <w:txbxContent>
                           <w:p>
                             <w:r>
-                              <w:t>Mary</w:t>
+                              <w:t>Margaret</w:t>
                             </w:r>
                           </w:p>
                         </w:txbxContent>
@@ -2232,12 +3524,12 @@
           </mc:Choice>
           <mc:Fallback>
             <w:pict>
-              <v:shape w14:anchorId="08D726C4" id="_x0000_s1036" type="#_x0000_t202" style="position:absolute;margin-left:332.4pt;margin-top:45.45pt;width:48pt;height:24.6pt;z-index:251670528;visibility:visible;mso-wrap-style:square;mso-width-percent:0;mso-height-percent:0;mso-wrap-distance-left:9pt;mso-wrap-distance-top:3.6pt;mso-wrap-distance-right:9pt;mso-wrap-distance-bottom:3.6pt;mso-position-horizontal:absolute;mso-position-horizontal-relative:text;mso-position-vertical:absolute;mso-position-vertical-relative:text;mso-width-percent:0;mso-height-percent:0;mso-width-relative:margin;mso-height-relative:margin;v-text-anchor:top" o:gfxdata="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">
+              <v:shape w14:anchorId="3BDF370E" id="_x0000_s1041" type="#_x0000_t202" style="position:absolute;margin-left:5.4pt;margin-top:16.3pt;width:63pt;height:24pt;z-index:251666432;visibility:visible;mso-wrap-style:square;mso-width-percent:0;mso-height-percent:0;mso-wrap-distance-left:9pt;mso-wrap-distance-top:3.6pt;mso-wrap-distance-right:9pt;mso-wrap-distance-bottom:3.6pt;mso-position-horizontal:absolute;mso-position-horizontal-relative:text;mso-position-vertical:absolute;mso-position-vertical-relative:text;mso-width-percent:0;mso-height-percent:0;mso-width-relative:margin;mso-height-relative:margin;v-text-anchor:top" o:gfxdata="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">
                 <v:textbox>
                   <w:txbxContent>
                     <w:p>
                       <w:r>
-                        <w:t>Mary</w:t>
+                        <w:t>Margaret</w:t>
                       </w:r>
                     </w:p>
                   </w:txbxContent>
@@ -2255,18 +3547,18 @@
         <mc:AlternateContent>
           <mc:Choice Requires="wps">
             <w:drawing>
-              <wp:anchor distT="45720" distB="45720" distL="114300" distR="114300" simplePos="0" relativeHeight="251666432" behindDoc="0" locked="0" layoutInCell="1" allowOverlap="1" wp14:anchorId="3BDF370E" wp14:editId="2A540136">
+              <wp:anchor distT="45720" distB="45720" distL="114300" distR="114300" simplePos="0" relativeHeight="251668480" behindDoc="0" locked="0" layoutInCell="1" allowOverlap="1" wp14:anchorId="257D8C08" wp14:editId="71AF4B11">
                 <wp:simplePos x="0" y="0"/>
                 <wp:positionH relativeFrom="column">
-                  <wp:posOffset>68580</wp:posOffset>
+                  <wp:posOffset>1958340</wp:posOffset>
                 </wp:positionH>
                 <wp:positionV relativeFrom="paragraph">
-                  <wp:posOffset>523875</wp:posOffset>
+                  <wp:posOffset>229870</wp:posOffset>
                 </wp:positionV>
-                <wp:extent cx="815340" cy="312420"/>
-                <wp:effectExtent l="0" t="0" r="22860" b="11430"/>
+                <wp:extent cx="975360" cy="335280"/>
+                <wp:effectExtent l="0" t="0" r="15240" b="26670"/>
                 <wp:wrapSquare wrapText="bothSides"/>
-                <wp:docPr id="1890870519" name="Text Box 2"/>
+                <wp:docPr id="979745617" name="Text Box 2"/>
                 <wp:cNvGraphicFramePr>
                   <a:graphicFrameLocks xmlns:a="http://schemas.openxmlformats.org/drawingml/2006/main"/>
                 </wp:cNvGraphicFramePr>
@@ -2279,7 +3571,7 @@
                       <wps:spPr bwMode="auto">
                         <a:xfrm>
                           <a:off x="0" y="0"/>
-                          <a:ext cx="815340" cy="312420"/>
+                          <a:ext cx="975360" cy="335280"/>
                         </a:xfrm>
                         <a:prstGeom prst="rect">
                           <a:avLst/>
@@ -2299,97 +3591,17 @@
                       <wps:txbx>
                         <w:txbxContent>
                           <w:p>
+                            <w:pPr>
+                              <w:rPr>
+                                <w:b/>
+                                <w:bCs/>
+                              </w:rPr>
+                            </w:pPr>
                             <w:r>
-                              <w:t>Margarett</w:t>
-                            </w:r>
-                          </w:p>
-                        </w:txbxContent>
-                      </wps:txbx>
-                      <wps:bodyPr rot="0" vert="horz" wrap="square" lIns="91440" tIns="45720" rIns="91440" bIns="45720" anchor="t" anchorCtr="0">
-                        <a:noAutofit/>
-                      </wps:bodyPr>
-                    </wps:wsp>
-                  </a:graphicData>
-                </a:graphic>
-                <wp14:sizeRelH relativeFrom="margin">
-                  <wp14:pctWidth>0</wp14:pctWidth>
-                </wp14:sizeRelH>
-                <wp14:sizeRelV relativeFrom="margin">
-                  <wp14:pctHeight>0</wp14:pctHeight>
-                </wp14:sizeRelV>
-              </wp:anchor>
-            </w:drawing>
-          </mc:Choice>
-          <mc:Fallback>
-            <w:pict>
-              <v:shape w14:anchorId="3BDF370E" id="_x0000_s1037" type="#_x0000_t202" style="position:absolute;margin-left:5.4pt;margin-top:41.25pt;width:64.2pt;height:24.6pt;z-index:251666432;visibility:visible;mso-wrap-style:square;mso-width-percent:0;mso-height-percent:0;mso-wrap-distance-left:9pt;mso-wrap-distance-top:3.6pt;mso-wrap-distance-right:9pt;mso-wrap-distance-bottom:3.6pt;mso-position-horizontal:absolute;mso-position-horizontal-relative:text;mso-position-vertical:absolute;mso-position-vertical-relative:text;mso-width-percent:0;mso-height-percent:0;mso-width-relative:margin;mso-height-relative:margin;v-text-anchor:top" o:gfxdata="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">
-                <v:textbox>
-                  <w:txbxContent>
-                    <w:p>
-                      <w:r>
-                        <w:t>Margarett</w:t>
-                      </w:r>
-                    </w:p>
-                  </w:txbxContent>
-                </v:textbox>
-                <w10:wrap type="square"/>
-              </v:shape>
-            </w:pict>
-          </mc:Fallback>
-        </mc:AlternateContent>
-      </w:r>
-      <w:r>
-        <w:rPr>
-          <w:noProof/>
-        </w:rPr>
-        <mc:AlternateContent>
-          <mc:Choice Requires="wps">
-            <w:drawing>
-              <wp:anchor distT="45720" distB="45720" distL="114300" distR="114300" simplePos="0" relativeHeight="251668480" behindDoc="0" locked="0" layoutInCell="1" allowOverlap="1" wp14:anchorId="257D8C08" wp14:editId="27C98CB4">
-                <wp:simplePos x="0" y="0"/>
-                <wp:positionH relativeFrom="column">
-                  <wp:posOffset>1958340</wp:posOffset>
-                </wp:positionH>
-                <wp:positionV relativeFrom="paragraph">
-                  <wp:posOffset>546735</wp:posOffset>
-                </wp:positionV>
-                <wp:extent cx="868680" cy="335280"/>
-                <wp:effectExtent l="0" t="0" r="26670" b="26670"/>
-                <wp:wrapSquare wrapText="bothSides"/>
-                <wp:docPr id="979745617" name="Text Box 2"/>
-                <wp:cNvGraphicFramePr>
-                  <a:graphicFrameLocks xmlns:a="http://schemas.openxmlformats.org/drawingml/2006/main"/>
-                </wp:cNvGraphicFramePr>
-                <a:graphic xmlns:a="http://schemas.openxmlformats.org/drawingml/2006/main">
-                  <a:graphicData uri="http://schemas.microsoft.com/office/word/2010/wordprocessingShape">
-                    <wps:wsp>
-                      <wps:cNvSpPr txBox="1">
-                        <a:spLocks noChangeArrowheads="1"/>
-                      </wps:cNvSpPr>
-                      <wps:spPr bwMode="auto">
-                        <a:xfrm>
-                          <a:off x="0" y="0"/>
-                          <a:ext cx="868680" cy="335280"/>
-                        </a:xfrm>
-                        <a:prstGeom prst="rect">
-                          <a:avLst/>
-                        </a:prstGeom>
-                        <a:solidFill>
-                          <a:srgbClr val="FFFFFF"/>
-                        </a:solidFill>
-                        <a:ln w="9525">
-                          <a:solidFill>
-                            <a:srgbClr val="000000"/>
-                          </a:solidFill>
-                          <a:miter lim="800000"/>
-                          <a:headEnd/>
-                          <a:tailEnd/>
-                        </a:ln>
-                      </wps:spPr>
-                      <wps:txbx>
-                        <w:txbxContent>
-                          <w:p>
-                            <w:r>
+                              <w:rPr>
+                                <w:b/>
+                                <w:bCs/>
+                              </w:rPr>
                               <w:t>Henry VIII</w:t>
                             </w:r>
                           </w:p>
@@ -2412,11 +3624,21 @@
           </mc:Choice>
           <mc:Fallback>
             <w:pict>
-              <v:shape w14:anchorId="257D8C08" id="_x0000_s1038" type="#_x0000_t202" style="position:absolute;margin-left:154.2pt;margin-top:43.05pt;width:68.4pt;height:26.4pt;z-index:251668480;visibility:visible;mso-wrap-style:square;mso-width-percent:0;mso-height-percent:0;mso-wrap-distance-left:9pt;mso-wrap-distance-top:3.6pt;mso-wrap-distance-right:9pt;mso-wrap-distance-bottom:3.6pt;mso-position-horizontal:absolute;mso-position-horizontal-relative:text;mso-position-vertical:absolute;mso-position-vertical-relative:text;mso-width-percent:0;mso-height-percent:0;mso-width-relative:margin;mso-height-relative:margin;v-text-anchor:top" o:gfxdata="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">
+              <v:shape w14:anchorId="257D8C08" id="_x0000_s1042" type="#_x0000_t202" style="position:absolute;margin-left:154.2pt;margin-top:18.1pt;width:76.8pt;height:26.4pt;z-index:251668480;visibility:visible;mso-wrap-style:square;mso-width-percent:0;mso-height-percent:0;mso-wrap-distance-left:9pt;mso-wrap-distance-top:3.6pt;mso-wrap-distance-right:9pt;mso-wrap-distance-bottom:3.6pt;mso-position-horizontal:absolute;mso-position-horizontal-relative:text;mso-position-vertical:absolute;mso-position-vertical-relative:text;mso-width-percent:0;mso-height-percent:0;mso-width-relative:margin;mso-height-relative:margin;v-text-anchor:top" o:gfxdata="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">
                 <v:textbox>
                   <w:txbxContent>
                     <w:p>
+                      <w:pPr>
+                        <w:rPr>
+                          <w:b/>
+                          <w:bCs/>
+                        </w:rPr>
+                      </w:pPr>
                       <w:r>
+                        <w:rPr>
+                          <w:b/>
+                          <w:bCs/>
+                        </w:rPr>
                         <w:t>Henry VIII</w:t>
                       </w:r>
                     </w:p>
@@ -2428,6 +3650,8 @@
           </mc:Fallback>
         </mc:AlternateContent>
       </w:r>
+    </w:p>
+    <w:p>
       <w:r>
         <w:rPr>
           <w:noProof/>
@@ -2435,27 +3659,27 @@
         <mc:AlternateContent>
           <mc:Choice Requires="wps">
             <w:drawing>
-              <wp:anchor distT="0" distB="0" distL="114300" distR="114300" simplePos="0" relativeHeight="251664384" behindDoc="0" locked="0" layoutInCell="1" allowOverlap="1" wp14:anchorId="63EF3B5A" wp14:editId="52AF08D0">
+              <wp:anchor distT="0" distB="0" distL="114300" distR="114300" simplePos="0" relativeHeight="251678720" behindDoc="0" locked="0" layoutInCell="1" allowOverlap="1" wp14:anchorId="4089B572" wp14:editId="1D4D5982">
                 <wp:simplePos x="0" y="0"/>
                 <wp:positionH relativeFrom="column">
-                  <wp:posOffset>2423160</wp:posOffset>
+                  <wp:posOffset>457200</wp:posOffset>
                 </wp:positionH>
                 <wp:positionV relativeFrom="paragraph">
-                  <wp:posOffset>51435</wp:posOffset>
+                  <wp:posOffset>187325</wp:posOffset>
                 </wp:positionV>
-                <wp:extent cx="7620" cy="60960"/>
-                <wp:effectExtent l="0" t="0" r="30480" b="15240"/>
+                <wp:extent cx="7620" cy="381000"/>
+                <wp:effectExtent l="0" t="0" r="30480" b="19050"/>
                 <wp:wrapNone/>
-                <wp:docPr id="1652242146" name="Straight Connector 5"/>
+                <wp:docPr id="1801945019" name="Straight Connector 14"/>
                 <wp:cNvGraphicFramePr/>
                 <a:graphic xmlns:a="http://schemas.openxmlformats.org/drawingml/2006/main">
                   <a:graphicData uri="http://schemas.microsoft.com/office/word/2010/wordprocessingShape">
                     <wps:wsp>
                       <wps:cNvCnPr/>
                       <wps:spPr>
-                        <a:xfrm flipV="1">
+                        <a:xfrm>
                           <a:off x="0" y="0"/>
-                          <a:ext cx="7620" cy="60960"/>
+                          <a:ext cx="7620" cy="381000"/>
                         </a:xfrm>
                         <a:prstGeom prst="line">
                           <a:avLst/>
@@ -2463,13 +3687,13 @@
                       </wps:spPr>
                       <wps:style>
                         <a:lnRef idx="2">
-                          <a:schemeClr val="accent1"/>
+                          <a:schemeClr val="dk1"/>
                         </a:lnRef>
                         <a:fillRef idx="0">
-                          <a:schemeClr val="accent1"/>
+                          <a:schemeClr val="dk1"/>
                         </a:fillRef>
                         <a:effectRef idx="1">
-                          <a:schemeClr val="accent1"/>
+                          <a:schemeClr val="dk1"/>
                         </a:effectRef>
                         <a:fontRef idx="minor">
                           <a:schemeClr val="tx1"/>
@@ -2479,17 +3703,321 @@
                     </wps:wsp>
                   </a:graphicData>
                 </a:graphic>
+                <wp14:sizeRelH relativeFrom="margin">
+                  <wp14:pctWidth>0</wp14:pctWidth>
+                </wp14:sizeRelH>
+                <wp14:sizeRelV relativeFrom="margin">
+                  <wp14:pctHeight>0</wp14:pctHeight>
+                </wp14:sizeRelV>
               </wp:anchor>
             </w:drawing>
           </mc:Choice>
           <mc:Fallback>
             <w:pict>
-              <v:line w14:anchorId="7515B2B2" id="Straight Connector 5" o:spid="_x0000_s1026" style="position:absolute;flip:y;z-index:251664384;visibility:visible;mso-wrap-style:square;mso-wrap-distance-left:9pt;mso-wrap-distance-top:0;mso-wrap-distance-right:9pt;mso-wrap-distance-bottom:0;mso-position-horizontal:absolute;mso-position-horizontal-relative:text;mso-position-vertical:absolute;mso-position-vertical-relative:text" from="190.8pt,4.05pt" to="191.4pt,8.85pt" o:gfxdata="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" strokecolor="#156082 [3204]" strokeweight="1.5pt">
+              <v:line w14:anchorId="7E9780AD" id="Straight Connector 14" o:spid="_x0000_s1026" style="position:absolute;z-index:251678720;visibility:visible;mso-wrap-style:square;mso-width-percent:0;mso-height-percent:0;mso-wrap-distance-left:9pt;mso-wrap-distance-top:0;mso-wrap-distance-right:9pt;mso-wrap-distance-bottom:0;mso-position-horizontal:absolute;mso-position-horizontal-relative:text;mso-position-vertical:absolute;mso-position-vertical-relative:text;mso-width-percent:0;mso-height-percent:0;mso-width-relative:margin;mso-height-relative:margin" from="36pt,14.75pt" to="36.6pt,44.75pt" o:gfxdata="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" strokecolor="black [3200]" strokeweight="1.5pt">
                 <v:stroke joinstyle="miter"/>
               </v:line>
             </w:pict>
           </mc:Fallback>
         </mc:AlternateContent>
+      </w:r>
+    </w:p>
+    <w:p/>
+    <w:p/>
+    <w:p/>
+    <w:p/>
+    <w:p/>
+    <w:p/>
+    <w:p/>
+    <w:p/>
+    <w:p>
+      <w:r>
+        <w:lastRenderedPageBreak/>
+        <w:drawing>
+          <wp:inline distT="0" distB="0" distL="0" distR="0" wp14:anchorId="067DE58F" wp14:editId="62FB6A42">
+            <wp:extent cx="5943600" cy="3599815"/>
+            <wp:effectExtent l="0" t="0" r="0" b="635"/>
+            <wp:docPr id="2099015372" name="Picture 1"/>
+            <wp:cNvGraphicFramePr>
+              <a:graphicFrameLocks xmlns:a="http://schemas.openxmlformats.org/drawingml/2006/main" noChangeAspect="1"/>
+            </wp:cNvGraphicFramePr>
+            <a:graphic xmlns:a="http://schemas.openxmlformats.org/drawingml/2006/main">
+              <a:graphicData uri="http://schemas.openxmlformats.org/drawingml/2006/picture">
+                <pic:pic xmlns:pic="http://schemas.openxmlformats.org/drawingml/2006/picture">
+                  <pic:nvPicPr>
+                    <pic:cNvPr id="2099015372" name=""/>
+                    <pic:cNvPicPr/>
+                  </pic:nvPicPr>
+                  <pic:blipFill>
+                    <a:blip r:embed="rId8"/>
+                    <a:stretch>
+                      <a:fillRect/>
+                    </a:stretch>
+                  </pic:blipFill>
+                  <pic:spPr>
+                    <a:xfrm>
+                      <a:off x="0" y="0"/>
+                      <a:ext cx="5943600" cy="3599815"/>
+                    </a:xfrm>
+                    <a:prstGeom prst="rect">
+                      <a:avLst/>
+                    </a:prstGeom>
+                  </pic:spPr>
+                </pic:pic>
+              </a:graphicData>
+            </a:graphic>
+          </wp:inline>
+        </w:drawing>
+      </w:r>
+    </w:p>
+    <w:p/>
+    <w:p>
+      <w:r>
+        <w:rPr>
+          <w:b/>
+          <w:bCs/>
+        </w:rPr>
+        <w:t xml:space="preserve">Explanation of the Normal English Line of Succession to the Throne in the 1500s:  </w:t>
+      </w:r>
+      <w:r>
+        <w:t>Henry VIII was the surviving son of Henry VII.  Though he did have an older sister</w:t>
+      </w:r>
+      <w:r>
+        <w:t xml:space="preserve">: </w:t>
+      </w:r>
+      <w:r>
+        <w:t>Margaret, the law of succession at the time was for male preference primogeniture</w:t>
+      </w:r>
+      <w:r>
+        <w:t xml:space="preserve"> (only changed to absolute primogeniture in 2015 – meaning birth order only, regardless of gender)</w:t>
+      </w:r>
+      <w:r>
+        <w:t>, this meant that all sons in birth order, had preference over daughters.  After that, it was all daughters in birth order.</w:t>
+      </w:r>
+      <w:r>
+        <w:t xml:space="preserve">  </w:t>
+      </w:r>
+    </w:p>
+    <w:p>
+      <w:r>
+        <w:t>So that is why, despite Edward VI being the youngest of Henry VIII’s children, he reigned first, and his older sisters reigned after him.</w:t>
+      </w:r>
+      <w:r>
+        <w:t xml:space="preserve">  </w:t>
+      </w:r>
+      <w:r>
+        <w:t>So, in terms of the laws of succession at the time, if Henry’s children died childless (which did end up happening) then the next person in the line of succession would come from</w:t>
+      </w:r>
+      <w:r>
+        <w:t xml:space="preserve"> the line of</w:t>
+      </w:r>
+      <w:r>
+        <w:t xml:space="preserve"> his older sister Margaret.</w:t>
+      </w:r>
+      <w:r>
+        <w:t xml:space="preserve">  So ultimately the rules were followed, and after Elizabeth I died childless, she was succeeded by James VI of Scotland, who also became James I of England, thus forever reuniting the crowns of Scotland and England (still the case today).</w:t>
+      </w:r>
+      <w:r>
+        <w:t xml:space="preserve"> </w:t>
+      </w:r>
+    </w:p>
+    <w:p/>
+    <w:p>
+      <w:r>
+        <w:rPr>
+          <w:b/>
+          <w:bCs/>
+        </w:rPr>
+        <w:t xml:space="preserve">How Henry Wanted to Alter the Succession:  </w:t>
+      </w:r>
+      <w:r>
+        <w:t xml:space="preserve">However, Henry wanted to alter his will so that after Elizabeth I’s death, the throne would bypass Margaret and go to his younger sister Mary and her descendants.  He did this because he didn’t want the thrones of England and Scotland to be united.  This was because Margaret had married King James IV of Scotland, </w:t>
+      </w:r>
+      <w:r>
+        <w:lastRenderedPageBreak/>
+        <w:t xml:space="preserve">but her son, James V, </w:t>
+      </w:r>
+      <w:r>
+        <w:t>(</w:t>
+      </w:r>
+      <w:r>
+        <w:t>Henry’s nephew</w:t>
+      </w:r>
+      <w:r>
+        <w:t xml:space="preserve">) </w:t>
+      </w:r>
+      <w:r>
+        <w:t>had made a failed attempt to invade and take over England.  Later, when Henry proposed the marriage of Edward VI to Mary Queen of Scots to unite the British and Scottish thrones at the next generation</w:t>
+      </w:r>
+      <w:r>
+        <w:t xml:space="preserve"> after them</w:t>
+      </w:r>
+      <w:r>
+        <w:t>, the Scots disagreed and took Mary over to France for safekeeping.  So, a</w:t>
+      </w:r>
+      <w:r>
+        <w:t>ngry at this</w:t>
+      </w:r>
+      <w:r>
+        <w:t>, he thought that if the British and Scottish thrones were united</w:t>
+      </w:r>
+      <w:r>
+        <w:t xml:space="preserve"> after he died</w:t>
+      </w:r>
+      <w:r>
+        <w:t>, then the Scots would win, and he didn’t want this.</w:t>
+      </w:r>
+    </w:p>
+    <w:p>
+      <w:r>
+        <w:t>So</w:t>
+      </w:r>
+      <w:r>
+        <w:t>,</w:t>
+      </w:r>
+      <w:r>
+        <w:t xml:space="preserve"> in terms of Henry’s will, the next person in line if Elizabeth I died childless w</w:t>
+      </w:r>
+      <w:r>
+        <w:t xml:space="preserve">as </w:t>
+      </w:r>
+      <w:r>
+        <w:t xml:space="preserve">Frances Brandon, </w:t>
+      </w:r>
+      <w:r>
+        <w:t xml:space="preserve">(his niece) </w:t>
+      </w:r>
+      <w:r>
+        <w:t>and then her daughter Jane Grey.  Henry’s will name</w:t>
+      </w:r>
+      <w:r>
+        <w:t>d</w:t>
+      </w:r>
+      <w:r>
+        <w:t xml:space="preserve"> his successors after Elizabeth as: Fraces, Jane, Katherine, (Edward Seymour – Katherine’s son - wasn’t born yet) Mary, </w:t>
+      </w:r>
+      <w:r>
+        <w:t>Eleanor and Margaret.</w:t>
+      </w:r>
+      <w:r>
+        <w:t xml:space="preserve">  </w:t>
+      </w:r>
+      <w:r>
+        <w:t xml:space="preserve"> </w:t>
+      </w:r>
+    </w:p>
+    <w:p/>
+    <w:p>
+      <w:r>
+        <w:rPr>
+          <w:b/>
+          <w:bCs/>
+        </w:rPr>
+        <w:t xml:space="preserve">How Edward VI Wanted to Alter the Succession:  </w:t>
+      </w:r>
+      <w:r>
+        <w:t>Edward VI, when he knew he was dying, was urged by his regency council to make his will so that Mary I, a Catholic, would not inherit and disrupt all the progress that Edward had made in terms of making England Protestant.  Therefore, he made his will similar to Henry’s where instead of having Mary and then Elizabeth as successors, he skipped over them, and the next person after them in Henry’s will: Frances Brandon</w:t>
+      </w:r>
+      <w:r>
+        <w:t xml:space="preserve"> </w:t>
+      </w:r>
+      <w:r>
+        <w:t>and instead named her daughter Jane Grey as heiress.  If Jane didn’t have children, the throne was to pass to Katherine Grey and her son, and then to Mary Grey, the</w:t>
+      </w:r>
+      <w:r>
+        <w:t>n</w:t>
+      </w:r>
+      <w:r>
+        <w:t xml:space="preserve"> Eleanor and Margaret.  </w:t>
+      </w:r>
+    </w:p>
+    <w:p>
+      <w:r>
+        <w:t>The reason why he didn’t name Frances as his successor</w:t>
+      </w:r>
+      <w:r>
+        <w:t xml:space="preserve"> </w:t>
+      </w:r>
+      <w:r>
+        <w:t xml:space="preserve">was that Jane Grey’s </w:t>
+      </w:r>
+      <w:r>
+        <w:t>father-in-law</w:t>
+      </w:r>
+      <w:r>
+        <w:t xml:space="preserve"> was John Dudley, and she was married to his son Guilford.  Therefore, John urged Edward to name her as his heir, as he thought that that way he would be able to control his son, </w:t>
+      </w:r>
+      <w:r>
+        <w:t xml:space="preserve">who would tell </w:t>
+      </w:r>
+      <w:r>
+        <w:t xml:space="preserve">Jane </w:t>
+      </w:r>
+      <w:r>
+        <w:t xml:space="preserve">what to do, </w:t>
+      </w:r>
+      <w:r>
+        <w:t>and</w:t>
+      </w:r>
+      <w:r>
+        <w:t xml:space="preserve"> through them, John would</w:t>
+      </w:r>
+      <w:r>
+        <w:t xml:space="preserve"> ultimately become King of England in all but name.  Though of course this plan failed, and while Jane was declared Queen of England, and Dudley got an army to challenge Mary I, he realized that he was outnumbered by her forces.  So</w:t>
+      </w:r>
+      <w:r>
+        <w:t>,</w:t>
+      </w:r>
+      <w:r>
+        <w:t xml:space="preserve"> the council</w:t>
+      </w:r>
+      <w:r>
+        <w:t>, after</w:t>
+      </w:r>
+      <w:r>
+        <w:t xml:space="preserve"> only nine days</w:t>
+      </w:r>
+      <w:r>
+        <w:t xml:space="preserve"> on the throne</w:t>
+      </w:r>
+      <w:r>
+        <w:t>,</w:t>
+      </w:r>
+      <w:r>
+        <w:t xml:space="preserve"> t</w:t>
+      </w:r>
+      <w:r>
+        <w:t>old</w:t>
+      </w:r>
+      <w:r>
+        <w:t xml:space="preserve"> Jane </w:t>
+      </w:r>
+      <w:r>
+        <w:t xml:space="preserve">that </w:t>
+      </w:r>
+      <w:r>
+        <w:t>she was no longer queen</w:t>
+      </w:r>
+      <w:r>
+        <w:t xml:space="preserve"> and </w:t>
+      </w:r>
+      <w:r>
+        <w:t xml:space="preserve">ordered </w:t>
+      </w:r>
+      <w:r>
+        <w:t xml:space="preserve">John </w:t>
+      </w:r>
+      <w:r>
+        <w:t>to stand</w:t>
+      </w:r>
+      <w:r>
+        <w:t xml:space="preserve"> </w:t>
+      </w:r>
+      <w:r>
+        <w:t>down and proclaim Mary I as the rightful Queen of England</w:t>
+      </w:r>
+      <w:r>
+        <w:t xml:space="preserve">, which he did.  </w:t>
       </w:r>
     </w:p>
     <w:sectPr>

</xml_diff>